<commit_message>
test: validate five-kernel teaching interactions and long-tail retrieval
Clarify learner-state kernels, teaching objects and workbench responsibilities in the Chinese manuscript. Add frozen native interaction and long-history retrieval evaluations, retained failed runs, raw recomputation, figures and final Word/PDF artifacts.

Validation: 154 evaluation tests and 63 targeted product regressions passed; 26 pages visually checked. Interaction findings remain 13/14 scenarios; all 228 retrieval reads are integrity-valid with quality failures retained. Contract impact: none. Local-only delivery; no push or deployment.
</commit_message>
<xml_diff>
--- a/docs/research/five-kernel-learner-memory-paper/five_kernel_learner_memory_zh.docx
+++ b/docs/research/five-kernel-learner-memory-paper/five_kernel_learner_memory_zh.docx
@@ -37,7 +37,7 @@
           <w:rFonts w:ascii="Times New Roman" w:hAnsi="Times New Roman" w:eastAsia="Songti SC"/>
           <w:color w:val="000000"/>
         </w:rPr>
-        <w:t>教育智能体需要记住的并不只是学生说过什么，还包括某项表现发生在何种辅助条件下、学习安排是否仍然有效，以及这些证据允许系统作出何种教学判断。已有检索、分层记忆和学习者建模研究分别提供了信息访问、长期交互和知识状态估计能力，但将这些能力连接为可追溯的教学状态更新仍需明确的工程契约。本文提出并实现一种五核学习者记忆架构，将学习位置、知识证据、支持条件、目标优先级和实践表现分别组织为 Structure、Knowledge、Human、Value 和 Practice 五个互补状态维度。系统通过统一事件、确定性归约和有来源的记忆投影维护状态，区分事实记录、条件适用性与教学结论。研究通过十五项原生能力契约核验，并结合既有检索压力测试和等信息的模型读取反事实实验评价系统。最后一项实验以八道可执行计算题构造九十六条合成轨迹，在两种组织方式、两种资格注释设置和两档输入预算下获得七百六十八条真实模型响应。严格计分下，五核组织在仅来源条件下将完整操作一致性提高了57.29和48.96个百分点；加入相同资格注释后，分组差异为−2.08和−3.13个百分点。事后单别名归一使后两项差异变为0和+4.17个百分点，表明细小排序对输出契约敏感。结果较稳定地支持对时效、辅助条件和证据资格进行显式管理，尚不足以证明五核分组本身具有稳健独立优势。本文的贡献在于可执行的学习者状态分工、统一证据治理及可审计的评测方法，而非新的知识追踪算法或已证实的学习增益。</w:t>
+        <w:t>教育智能体需要区分学习者状态、教学安排与界面操作：确认学习路径不等于掌握知识，复习到期不等于知识遗忘，完成任务也不能替代正式能力证据。本文提出并实现一种面向计算机专业教育的五核学习者记忆架构，以Structure、Knowledge、Human、Value和Practice分别表示学习位置、概念证据、支持条件、目标优先级及实践表现，通过统一事件与确定性归约维护状态，并连接学习路径、LearningTask和复习工作台。研究结合原生能力、对象交互、长尾来源读取及等信息模型实验评价各环节。新增十四个对象交互情境中十三个通过，唯一状态失效挑战表明，复习再次答错后工作台已降级，但长期stable标记仍保留。十二个教育情境的十三个查询形成228次实际读取；在4、64、256条后续干扰下，默认配置的目标与限定同条交付分别为7/10、6/10、6/10，启用来源正文读取分别为9/10、8/10、7/10，两档预算结果相同。扩大候选范围也导致一个错拼情境退化，词表外表达仍未解决。既有768条等信息模型响应进一步表明，显式资格注释有较稳定作用，而五核分组的独立增量对信息条件和输出契约敏感。结果支持将教育记忆视为连接教学对象的证据与状态层，同时揭示状态失效和长尾检索的具体工程边界；本文不据作者合成情境宣称真实学习增益或五核全面优于现有记忆方法。</w:t>
       </w:r>
     </w:p>
     <w:p>
@@ -54,7 +54,7 @@
           <w:rFonts w:ascii="Times New Roman" w:hAnsi="Times New Roman" w:eastAsia="Songti SC"/>
           <w:color w:val="000000"/>
         </w:rPr>
-        <w:t>：教育智能体；学习者建模；五核记忆；证据治理；反事实评测；计算机教育</w:t>
+        <w:t>：教育智能体；学习者建模；五核记忆；证据治理；长尾检索；教学对象；计算机教育</w:t>
       </w:r>
     </w:p>
     <w:p>
@@ -114,7 +114,7 @@
           <w:rFonts w:ascii="Times New Roman" w:hAnsi="Times New Roman" w:eastAsia="Songti SC"/>
           <w:color w:val="000000"/>
         </w:rPr>
-        <w:t>本文围绕三个研究问题展开。RQ1：五核各自提供了哪些可执行能力，哪些能力可由传统记忆或学习者建模方法提供？RQ2：在原始教育信息相同的条件下，五核组织和显式证据资格注释分别如何影响模型读取？RQ3：哪些失败来自记忆形成、检索、输出契约或最终约束执行，而不能通过增加记忆层数解决？</w:t>
+        <w:t>这种状态表示必须与教学对象区分。学习路径描述准备学习的课程与依赖，LearningTask 描述一次可执行任务，ReviewSchedule 描述复习调度，工作台提供操作入口；它们各自拥有业务状态。五核回答的是特定学习者与这些对象之间已经形成了何种关系、有哪些证据、当前可使用哪些条件。路径已确认不意味着知识已掌握，复习已到期不意味着知识已遗忘，工作台已展示也不意味着学生已完成。将这些状态混为一谈，会使界面操作越过证据边界。</w:t>
       </w:r>
     </w:p>
     <w:p>
@@ -126,7 +126,31 @@
           <w:rFonts w:ascii="Times New Roman" w:hAnsi="Times New Roman" w:eastAsia="Songti SC"/>
           <w:color w:val="000000"/>
         </w:rPr>
-        <w:t>本文的工作包括三个部分。首先，给出五核的责任边界、事件归约及来源闭包，并追踪到真实产品消费者。其次，构建不新增人工标注的能力契约核验和等信息反事实协议，将实现存在性与模型效果分开评价。最后，公开完整分母、错误响应、事后敏感性分析及代码版本限制，用实际结果限定贡献范围。本文不报告真实学生学习增益，不将本地检索适配器命名为外部算法的官方复现，也不把五核的分类数量本身视为性能来源。</w:t>
+        <w:t>这一差别在长历史和少见组合任务中更明显。例如，学生在数周后进入操作系统项目，需要重新使用过去在提示下学过的递归概念，但其目标已修订、当时的临时支持要求已过期。系统需要同时定位旧证据、判断其条件、连接当前教学对象并执行有效约束。五个字段齐全并不能保证该任务成功；稀有来源若未被召回，后续状态解释仍无从发生。本文因此分别评价对象交互、历史证据读取与等信息条件下的解释，避免将一个环节的通过率推广到整个教学过程。</w:t>
+      </w:r>
+    </w:p>
+    <w:p>
+      <w:pPr>
+        <w:ind w:firstLine="440"/>
+      </w:pPr>
+      <w:r>
+        <w:rPr>
+          <w:rFonts w:ascii="Times New Roman" w:hAnsi="Times New Roman" w:eastAsia="Songti SC"/>
+          <w:color w:val="000000"/>
+        </w:rPr>
+        <w:t>本文围绕四个研究问题展开。RQ1：五核分别提供哪些能力，如何与学习路径、学习任务和复习工作台分工交互？RQ2：在原始教育信息相同的条件下，五核组织和显式证据资格注释分别如何影响模型读取？RQ3：面对旧证据、表述变化、限定条件与时效冲突，系统的长尾处理能力止于哪一环节？RQ4：哪些失败来自记忆形成、检索、输出契约或最终约束执行，而不能通过增加记忆层数解决？</w:t>
+      </w:r>
+    </w:p>
+    <w:p>
+      <w:pPr>
+        <w:ind w:firstLine="440"/>
+      </w:pPr>
+      <w:r>
+        <w:rPr>
+          <w:rFonts w:ascii="Times New Roman" w:hAnsi="Times New Roman" w:eastAsia="Songti SC"/>
+          <w:color w:val="000000"/>
+        </w:rPr>
+        <w:t>本文的工作包括三个部分。首先，给出五核的责任边界、事件归约及来源闭包，说明其与路径、学习任务和复习工作台的实际联系。其次，构建不新增人工标注的能力核验、对象交互、长尾来源读取和等信息反事实协议，将实现存在性、证据交付与模型效果分开评价。最后，公开完整分母、错误响应、事后敏感性分析及代码版本限制，用实际结果限定贡献范围。本文不报告真实学生学习增益，不将本地检索适配器命名为外部算法的官方复现，也不把五核的分类数量本身视为性能来源。</w:t>
       </w:r>
     </w:p>
     <w:p>
@@ -2698,6 +2722,179 @@
     </w:p>
     <w:p>
       <w:pPr>
+        <w:pStyle w:val="Heading2"/>
+      </w:pPr>
+      <w:r>
+        <w:rPr>
+          <w:rFonts w:ascii="Times New Roman" w:hAnsi="Times New Roman" w:eastAsia="Songti SC"/>
+          <w:color w:val="000000"/>
+        </w:rPr>
+        <w:t>3.8 五核与教学对象及工作台的交互</w:t>
+      </w:r>
+    </w:p>
+    <w:p>
+      <w:pPr>
+        <w:ind w:firstLine="440"/>
+      </w:pPr>
+      <w:r>
+        <w:rPr>
+          <w:rFonts w:ascii="Times New Roman" w:hAnsi="Times New Roman" w:eastAsia="Songti SC"/>
+          <w:color w:val="000000"/>
+        </w:rPr>
+        <w:t>五核、教学对象与工作台是三种职责，而不是三套互相独立的用户画像。五核维护学习者状态的语义与证据权限；教学对象保存课程结构、任务规格和执行进度；工作台将对象及状态投影组织为可操作的界面。三类主 Agent 在这些层之间承担协调、教学设计和实践评价责任，工作台自身不获得直接写入 KernelState 的权限。</w:t>
+      </w:r>
+    </w:p>
+    <w:p>
+      <w:pPr>
+        <w:ind w:firstLine="440"/>
+      </w:pPr>
+      <w:r>
+        <w:rPr>
+          <w:rFonts w:ascii="Times New Roman" w:hAnsi="Times New Roman" w:eastAsia="Songti SC"/>
+          <w:color w:val="000000"/>
+        </w:rPr>
+        <w:t>学习路径需要区分规范路径图和个人确认安排。规范图提供课程节点与依赖，学习者确认的路线、目标和进度形成个人状态；当前实现将个人路径计划保存在 Structure 的 learning_path_plans 中，并通过 Value 的 confirmed_goals 关联目标。因此，本文的分层是语义和责任分层，不能误画成所有路径数据都位于五核以外。路径确认、修订和归档通过正式事件改变相应状态，原始事件保留。路径接口当前采用学习者全局范围，不具备本文其他检查点任务完全相同的作用域粒度。</w:t>
+      </w:r>
+    </w:p>
+    <w:p>
+      <w:pPr>
+        <w:ind w:firstLine="440"/>
+      </w:pPr>
+      <w:r>
+        <w:rPr>
+          <w:rFonts w:ascii="Times New Roman" w:hAnsi="Times New Roman" w:eastAsia="Songti SC"/>
+          <w:color w:val="000000"/>
+        </w:rPr>
+        <w:t>LearningTask 保存目标、阶段、来源和执行状态。规划器读取有作用域的学习者上下文，将有效预算、当前优先项、返回锚点及受助表现用于待执行阶段；开始或完成任务则属于业务生命周期。当前任务创建、接受、重规划、开始、暂停、恢复、阶段完成、产物生成、完成和取消事件均声明零核目标，即保留操作审计但不改变五核状态。生成一份任务规格或把阶段标为完成，不能直接替代 Practice 所需的正式尝试，也不能替代 Knowledge 的掌握判据。实际学习行为和正式测评需另行形成有相应核目标的证据事件。路径确认入口本身也不创建 LearningTask，后续任务启动是独立业务操作。</w:t>
+      </w:r>
+    </w:p>
+    <w:p>
+      <w:pPr>
+        <w:ind w:firstLine="440"/>
+      </w:pPr>
+      <w:r>
+        <w:rPr>
+          <w:rFonts w:ascii="Times New Roman" w:hAnsi="Times New Roman" w:eastAsia="Songti SC"/>
+          <w:color w:val="000000"/>
+        </w:rPr>
+        <w:t>复习工作台的关键对象是 ReviewSchedule。它保存到期时间、间隔等级、调度阶段和最近 Attempt/Event 标识，是可重建的调度投影。正式作答可以同时产生评分证据与调度更新：证据经 reducer 进入 Knowledge、Practice 等目标核，调度器根据结果及辅助条件计算下次安排。复习跳过、延期、暂停和恢复事件同样声明零核目标；review_attempt_evaluated 才具有 Knowledge、Practice 目标。仅打开、到期或延期不产生新的独立成功证据。复习提交则必须重新检查对象归属、呈现版本、作答类型及幂等信息；“提示后原题成功”“独立原题成功”和“独立验证变式成功”不能在下次安排和掌握更新中被无条件等同。</w:t>
+      </w:r>
+    </w:p>
+    <w:p>
+      <w:pPr>
+        <w:ind w:firstLine="440"/>
+      </w:pPr>
+      <w:r>
+        <w:rPr>
+          <w:rFonts w:ascii="Times New Roman" w:hAnsi="Times New Roman" w:eastAsia="Songti SC"/>
+          <w:color w:val="000000"/>
+        </w:rPr>
+        <w:t>这里“独立原题复习”表示本次复习未使用辅助，不表示题目新颖或完成迁移，仍需与变式资格分开；普通概念提交中的即时原题重试采用另一条保守辅助规则。当前 ReviewSchedule 与 LearningAttempt 没有会话字段，复习评分事件绑定学习者、项目与检查点，不能将这条链描述为与四维上下文完全相同的会话隔离。调度的可重建性依据既有Attempt与纠错记录的回填算法，也不等同于对任意历史事件序列的完全重放保证。</w:t>
+      </w:r>
+    </w:p>
+    <w:p>
+      <w:pPr>
+        <w:keepNext/>
+        <w:jc w:val="center"/>
+      </w:pPr>
+      <w:r>
+        <w:drawing>
+          <wp:inline xmlns:a="http://schemas.openxmlformats.org/drawingml/2006/main" xmlns:pic="http://schemas.openxmlformats.org/drawingml/2006/picture">
+            <wp:extent cx="6156000" cy="4104000"/>
+            <wp:docPr id="2" name="Picture 2"/>
+            <wp:cNvGraphicFramePr>
+              <a:graphicFrameLocks noChangeAspect="1"/>
+            </wp:cNvGraphicFramePr>
+            <a:graphic>
+              <a:graphicData uri="http://schemas.openxmlformats.org/drawingml/2006/picture">
+                <pic:pic>
+                  <pic:nvPicPr>
+                    <pic:cNvPr id="0" name="object_interaction.png"/>
+                    <pic:cNvPicPr/>
+                  </pic:nvPicPr>
+                  <pic:blipFill>
+                    <a:blip r:embed="rId12"/>
+                    <a:stretch>
+                      <a:fillRect/>
+                    </a:stretch>
+                  </pic:blipFill>
+                  <pic:spPr>
+                    <a:xfrm>
+                      <a:off x="0" y="0"/>
+                      <a:ext cx="6156000" cy="4104000"/>
+                    </a:xfrm>
+                    <a:prstGeom prst="rect"/>
+                  </pic:spPr>
+                </pic:pic>
+              </a:graphicData>
+            </a:graphic>
+          </wp:inline>
+        </w:drawing>
+      </w:r>
+    </w:p>
+    <w:p>
+      <w:pPr>
+        <w:pStyle w:val="Caption"/>
+        <w:keepNext w:val="0"/>
+      </w:pPr>
+      <w:r>
+        <w:rPr>
+          <w:rFonts w:ascii="Times New Roman" w:hAnsi="Times New Roman" w:eastAsia="Songti SC"/>
+          <w:color w:val="000000"/>
+        </w:rPr>
+        <w:t>图2 五核与教学对象、工作台的职责和交互。实线表示职责联系和状态读取，不表示每次操作串行调用全部 Agent。橙色路径表示统一事件入口，只有契约允许的事件才产生核变更；零核目标操作止于审计。ReviewSchedule 的调度更新不直接写 KernelState；个人确认路径的部分业务数据当前存于 Structure，并经 Value 关联目标。后文自动核验覆盖所列服务/API 函数，不代表浏览器和所有宿主已经完成端到端验收。</w:t>
+      </w:r>
+    </w:p>
+    <w:p>
+      <w:pPr>
+        <w:pStyle w:val="Heading2"/>
+      </w:pPr>
+      <w:r>
+        <w:rPr>
+          <w:rFonts w:ascii="Times New Roman" w:hAnsi="Times New Roman" w:eastAsia="Songti SC"/>
+          <w:color w:val="000000"/>
+        </w:rPr>
+        <w:t>3.9 长尾任务中的作用与能力边界</w:t>
+      </w:r>
+    </w:p>
+    <w:p>
+      <w:pPr>
+        <w:ind w:firstLine="440"/>
+      </w:pPr>
+      <w:r>
+        <w:rPr>
+          <w:rFonts w:ascii="Times New Roman" w:hAnsi="Times New Roman" w:eastAsia="Songti SC"/>
+          <w:color w:val="000000"/>
+        </w:rPr>
+        <w:t>本文将“长尾”操作化为作者构造的低重复证据和少见条件组合挑战，不声称已测得真实学生任务的频率分布。挑战包括：在较多后续记录中寻找旧问题；用同义或错拼表述访问既有证据；保留长原文中的适用条件；区分同主题最初问题与当前状态；在目标变化和控制过期后恢复教学；拒绝借用其他项目、学习者或不存在的证据。历史长度是同一情境的压力条件，不能被计为新的独立学生或新的教育任务。</w:t>
+      </w:r>
+    </w:p>
+    <w:p>
+      <w:pPr>
+        <w:ind w:firstLine="440"/>
+      </w:pPr>
+      <w:r>
+        <w:rPr>
+          <w:rFonts w:ascii="Times New Roman" w:hAnsi="Times New Roman" w:eastAsia="Songti SC"/>
+          <w:color w:val="000000"/>
+        </w:rPr>
+        <w:t>五核对这些任务的作用具有分工。Structure 连接当前任务与历史位置；Knowledge 提供具体概念问题及其解决证据；Practice 说明当时是否受助、是否只是原题重试；Human 排除已过期的支持条件；Value 连接当前已确认目标。一次跨课程恢复需要组合这些信息，却不能仅因为图中概念相邻就推断学生能够迁移。传统 RAG 或图记忆可以承担候选召回和关联，五核为召回内容补充教育状态语义；两者可以共同失效，也可以相互补充。</w:t>
+      </w:r>
+    </w:p>
+    <w:p>
+      <w:pPr>
+        <w:ind w:firstLine="440"/>
+      </w:pPr>
+      <w:r>
+        <w:rPr>
+          <w:rFonts w:ascii="Times New Roman" w:hAnsi="Times New Roman" w:eastAsia="Songti SC"/>
+          <w:color w:val="000000"/>
+        </w:rPr>
+        <w:t>当前检索实现具有显式术语归一、有限别名与错拼处理、时间候选配额、原文片段和有界图扩展；它们均有词表、候选窗口及预算边界。可配置的来源正文读取还会改变候选扫描范围，因此不能将启用该配置的全部改善归因为“分段更好”。本研究分别检查来源是否进入候选、是否交付到最终包、目标与限定是否共同保留，以及缺少直接来源时是否暴露证据缺口。再将对象交互测试用于检查证据资格如何影响实际调度和学习安排。只有两类验证连接到同一真实任务并检验最终操作，才可进一步声称完整长尾教学能力。</w:t>
+      </w:r>
+    </w:p>
+    <w:p>
+      <w:pPr>
         <w:pStyle w:val="Heading1"/>
       </w:pPr>
       <w:r>
@@ -2741,7 +2938,7 @@
           <w:rFonts w:ascii="Times New Roman" w:hAnsi="Times New Roman" w:eastAsia="Songti SC"/>
           <w:color w:val="000000"/>
         </w:rPr>
-        <w:t>本文显式区分代码版本。等信息模型读取实验冻结产品基线 a9375aa；本轮原生能力核验从917b8a0建立隔离工作树，并保存实际源码 hash。旧实验结果不会因当前仓库出现后续变更而被描述为当前生产版本的完整验收。共享核心、研究输入转换器及各宿主最终提示词也不是同一个消费接口，本文分别讨论其证据。</w:t>
+        <w:t>本文显式区分代码版本。等信息模型读取实验冻结产品基线 a9375aa；十五项原生能力核验从917b8a0建立隔离工作树；补充对象交互与长尾读取验证冻结于62fd197，读取策略为 relevance-budget.v4，并保存实际源码 hash。v4中的来源正文读取、紧凑episode和全池候选能力是可配置项，默认仍为 source_text=False、compact_episodes=False 和 legacy 候选。旧实验结果不会因当前仓库出现后续变更而被描述为当前生产版本的完整验收。共享核心、研究输入转换器及各宿主最终提示词也不是同一个消费接口，本文分别讨论其证据。</w:t>
       </w:r>
     </w:p>
     <w:p>
@@ -2765,7 +2962,7 @@
           <w:rFonts w:ascii="Times New Roman" w:hAnsi="Times New Roman" w:eastAsia="Songti SC"/>
           <w:color w:val="000000"/>
         </w:rPr>
-        <w:t>评价分为三个层次。第一层通过真实事件和产品消费者检查每核能力是否存在，以及负向边界是否成立。第二层使用已经完成的本地教育与通用记忆压力测试，分析召回和表示适配问题。第三层保持原始规范记录相同，以组织方式和资格注释两个因素检验真实模型读取。三层不能合并成一个总分，因为它们分别测量程序契约、检索行为和生成输出一致性。</w:t>
+        <w:t>评价分为三个层次。第一层通过真实事件和产品消费者检查每核能力与跨对象交互，并增加时间组合及稳定后失败的挑战。第二层使用既有压力测试及新增原生长历史读取，分析来源形成、候选召回、限定交付与表示适配。第三层保持原始规范记录相同，以组织方式和资格注释两个因素检验真实模型读取。三层不能合并成一个总分，因为它们分别测量程序契约、检索行为和生成输出一致性。</w:t>
       </w:r>
     </w:p>
     <w:p>
@@ -3115,6 +3312,147 @@
                 <w:color w:val="000000"/>
                 <w:sz w:val="19"/>
               </w:rPr>
+              <w:t>对象交互补充</w:t>
+            </w:r>
+          </w:p>
+        </w:tc>
+        <w:tc>
+          <w:tcPr>
+            <w:tcW w:type="dxa" w:w="2466"/>
+            <w:vAlign w:val="center"/>
+            <w:tcMar>
+              <w:top w:w="75" w:type="dxa"/>
+              <w:bottom w:w="75" w:type="dxa"/>
+              <w:left w:w="75" w:type="dxa"/>
+              <w:right w:w="75" w:type="dxa"/>
+            </w:tcMar>
+            <w:tcBorders>
+              <w:top w:val="single" w:sz="4" w:color="D9D9D9"/>
+              <w:left w:val="single" w:sz="4" w:color="D9D9D9"/>
+              <w:bottom w:val="single" w:sz="4" w:color="D9D9D9"/>
+              <w:right w:val="single" w:sz="4" w:color="D9D9D9"/>
+            </w:tcBorders>
+          </w:tcPr>
+          <w:p>
+            <w:pPr>
+              <w:spacing w:after="0" w:before="0" w:line="264" w:lineRule="auto"/>
+              <w:ind w:firstLine="0"/>
+              <w:jc w:val="left"/>
+            </w:pPr>
+            <w:r>
+              <w:rPr>
+                <w:rFonts w:ascii="Times New Roman" w:hAnsi="Times New Roman" w:eastAsia="Songti SC"/>
+                <w:b w:val="0"/>
+                <w:color w:val="000000"/>
+                <w:sz w:val="19"/>
+              </w:rPr>
+              <w:t>路径与复习 API 的实际执行轨迹</w:t>
+            </w:r>
+          </w:p>
+        </w:tc>
+        <w:tc>
+          <w:tcPr>
+            <w:tcW w:type="dxa" w:w="2920"/>
+            <w:vAlign w:val="center"/>
+            <w:tcMar>
+              <w:top w:w="75" w:type="dxa"/>
+              <w:bottom w:w="75" w:type="dxa"/>
+              <w:left w:w="75" w:type="dxa"/>
+              <w:right w:w="75" w:type="dxa"/>
+            </w:tcMar>
+            <w:tcBorders>
+              <w:top w:val="single" w:sz="4" w:color="D9D9D9"/>
+              <w:left w:val="single" w:sz="4" w:color="D9D9D9"/>
+              <w:bottom w:val="single" w:sz="4" w:color="D9D9D9"/>
+              <w:right w:val="single" w:sz="4" w:color="D9D9D9"/>
+            </w:tcBorders>
+          </w:tcPr>
+          <w:p>
+            <w:pPr>
+              <w:spacing w:after="0" w:before="0" w:line="264" w:lineRule="auto"/>
+              <w:ind w:firstLine="0"/>
+              <w:jc w:val="left"/>
+            </w:pPr>
+            <w:r>
+              <w:rPr>
+                <w:rFonts w:ascii="Times New Roman" w:hAnsi="Times New Roman" w:eastAsia="Songti SC"/>
+                <w:b w:val="0"/>
+                <w:color w:val="000000"/>
+                <w:sz w:val="19"/>
+              </w:rPr>
+              <w:t>操作状态、调度与学习证据是否一致</w:t>
+            </w:r>
+          </w:p>
+        </w:tc>
+        <w:tc>
+          <w:tcPr>
+            <w:tcW w:type="dxa" w:w="2971"/>
+            <w:vAlign w:val="center"/>
+            <w:tcMar>
+              <w:top w:w="75" w:type="dxa"/>
+              <w:bottom w:w="75" w:type="dxa"/>
+              <w:left w:w="75" w:type="dxa"/>
+              <w:right w:w="75" w:type="dxa"/>
+            </w:tcMar>
+            <w:tcBorders>
+              <w:top w:val="single" w:sz="4" w:color="D9D9D9"/>
+              <w:left w:val="single" w:sz="4" w:color="D9D9D9"/>
+              <w:bottom w:val="single" w:sz="4" w:color="D9D9D9"/>
+              <w:right w:val="single" w:sz="4" w:color="D9D9D9"/>
+            </w:tcBorders>
+          </w:tcPr>
+          <w:p>
+            <w:pPr>
+              <w:spacing w:after="0" w:before="0" w:line="264" w:lineRule="auto"/>
+              <w:ind w:firstLine="0"/>
+              <w:jc w:val="left"/>
+            </w:pPr>
+            <w:r>
+              <w:rPr>
+                <w:rFonts w:ascii="Times New Roman" w:hAnsi="Times New Roman" w:eastAsia="Songti SC"/>
+                <w:b w:val="0"/>
+                <w:color w:val="000000"/>
+                <w:sz w:val="19"/>
+              </w:rPr>
+              <w:t>浏览器或真实多周学习效果</w:t>
+            </w:r>
+          </w:p>
+        </w:tc>
+      </w:tr>
+      <w:tr>
+        <w:trPr>
+          <w:cantSplit/>
+        </w:trPr>
+        <w:tc>
+          <w:tcPr>
+            <w:tcW w:type="dxa" w:w="1389"/>
+            <w:vAlign w:val="center"/>
+            <w:tcMar>
+              <w:top w:w="75" w:type="dxa"/>
+              <w:bottom w:w="75" w:type="dxa"/>
+              <w:left w:w="75" w:type="dxa"/>
+              <w:right w:w="75" w:type="dxa"/>
+            </w:tcMar>
+            <w:tcBorders>
+              <w:top w:val="single" w:sz="4" w:color="D9D9D9"/>
+              <w:left w:val="single" w:sz="4" w:color="D9D9D9"/>
+              <w:bottom w:val="single" w:sz="4" w:color="D9D9D9"/>
+              <w:right w:val="single" w:sz="4" w:color="D9D9D9"/>
+            </w:tcBorders>
+          </w:tcPr>
+          <w:p>
+            <w:pPr>
+              <w:spacing w:after="0" w:before="0" w:line="264" w:lineRule="auto"/>
+              <w:ind w:firstLine="0"/>
+              <w:jc w:val="left"/>
+            </w:pPr>
+            <w:r>
+              <w:rPr>
+                <w:rFonts w:ascii="Times New Roman" w:hAnsi="Times New Roman" w:eastAsia="Songti SC"/>
+                <w:b w:val="0"/>
+                <w:color w:val="000000"/>
+                <w:sz w:val="19"/>
+              </w:rPr>
               <w:t>既有压力测试</w:t>
             </w:r>
           </w:p>
@@ -3218,6 +3556,147 @@
                 <w:sz w:val="19"/>
               </w:rPr>
               <w:t>官方外部算法统一排名</w:t>
+            </w:r>
+          </w:p>
+        </w:tc>
+      </w:tr>
+      <w:tr>
+        <w:trPr>
+          <w:cantSplit/>
+        </w:trPr>
+        <w:tc>
+          <w:tcPr>
+            <w:tcW w:type="dxa" w:w="1389"/>
+            <w:vAlign w:val="center"/>
+            <w:tcMar>
+              <w:top w:w="75" w:type="dxa"/>
+              <w:bottom w:w="75" w:type="dxa"/>
+              <w:left w:w="75" w:type="dxa"/>
+              <w:right w:w="75" w:type="dxa"/>
+            </w:tcMar>
+            <w:tcBorders>
+              <w:top w:val="single" w:sz="4" w:color="D9D9D9"/>
+              <w:left w:val="single" w:sz="4" w:color="D9D9D9"/>
+              <w:bottom w:val="single" w:sz="4" w:color="D9D9D9"/>
+              <w:right w:val="single" w:sz="4" w:color="D9D9D9"/>
+            </w:tcBorders>
+          </w:tcPr>
+          <w:p>
+            <w:pPr>
+              <w:spacing w:after="0" w:before="0" w:line="264" w:lineRule="auto"/>
+              <w:ind w:firstLine="0"/>
+              <w:jc w:val="left"/>
+            </w:pPr>
+            <w:r>
+              <w:rPr>
+                <w:rFonts w:ascii="Times New Roman" w:hAnsi="Times New Roman" w:eastAsia="Songti SC"/>
+                <w:b w:val="0"/>
+                <w:color w:val="000000"/>
+                <w:sz w:val="19"/>
+              </w:rPr>
+              <w:t>长尾读取补充</w:t>
+            </w:r>
+          </w:p>
+        </w:tc>
+        <w:tc>
+          <w:tcPr>
+            <w:tcW w:type="dxa" w:w="2466"/>
+            <w:vAlign w:val="center"/>
+            <w:tcMar>
+              <w:top w:w="75" w:type="dxa"/>
+              <w:bottom w:w="75" w:type="dxa"/>
+              <w:left w:w="75" w:type="dxa"/>
+              <w:right w:w="75" w:type="dxa"/>
+            </w:tcMar>
+            <w:tcBorders>
+              <w:top w:val="single" w:sz="4" w:color="D9D9D9"/>
+              <w:left w:val="single" w:sz="4" w:color="D9D9D9"/>
+              <w:bottom w:val="single" w:sz="4" w:color="D9D9D9"/>
+              <w:right w:val="single" w:sz="4" w:color="D9D9D9"/>
+            </w:tcBorders>
+          </w:tcPr>
+          <w:p>
+            <w:pPr>
+              <w:spacing w:after="0" w:before="0" w:line="264" w:lineRule="auto"/>
+              <w:ind w:firstLine="0"/>
+              <w:jc w:val="left"/>
+            </w:pPr>
+            <w:r>
+              <w:rPr>
+                <w:rFonts w:ascii="Times New Roman" w:hAnsi="Times New Roman" w:eastAsia="Songti SC"/>
+                <w:b w:val="0"/>
+                <w:color w:val="000000"/>
+                <w:sz w:val="19"/>
+              </w:rPr>
+              <w:t>作者情境×历史长度×预算×读取开关</w:t>
+            </w:r>
+          </w:p>
+        </w:tc>
+        <w:tc>
+          <w:tcPr>
+            <w:tcW w:type="dxa" w:w="2920"/>
+            <w:vAlign w:val="center"/>
+            <w:tcMar>
+              <w:top w:w="75" w:type="dxa"/>
+              <w:bottom w:w="75" w:type="dxa"/>
+              <w:left w:w="75" w:type="dxa"/>
+              <w:right w:w="75" w:type="dxa"/>
+            </w:tcMar>
+            <w:tcBorders>
+              <w:top w:val="single" w:sz="4" w:color="D9D9D9"/>
+              <w:left w:val="single" w:sz="4" w:color="D9D9D9"/>
+              <w:bottom w:val="single" w:sz="4" w:color="D9D9D9"/>
+              <w:right w:val="single" w:sz="4" w:color="D9D9D9"/>
+            </w:tcBorders>
+          </w:tcPr>
+          <w:p>
+            <w:pPr>
+              <w:spacing w:after="0" w:before="0" w:line="264" w:lineRule="auto"/>
+              <w:ind w:firstLine="0"/>
+              <w:jc w:val="left"/>
+            </w:pPr>
+            <w:r>
+              <w:rPr>
+                <w:rFonts w:ascii="Times New Roman" w:hAnsi="Times New Roman" w:eastAsia="Songti SC"/>
+                <w:b w:val="0"/>
+                <w:color w:val="000000"/>
+                <w:sz w:val="19"/>
+              </w:rPr>
+              <w:t>旧来源与限定能否交付，缺口是否可见</w:t>
+            </w:r>
+          </w:p>
+        </w:tc>
+        <w:tc>
+          <w:tcPr>
+            <w:tcW w:type="dxa" w:w="2971"/>
+            <w:vAlign w:val="center"/>
+            <w:tcMar>
+              <w:top w:w="75" w:type="dxa"/>
+              <w:bottom w:w="75" w:type="dxa"/>
+              <w:left w:w="75" w:type="dxa"/>
+              <w:right w:w="75" w:type="dxa"/>
+            </w:tcMar>
+            <w:tcBorders>
+              <w:top w:val="single" w:sz="4" w:color="D9D9D9"/>
+              <w:left w:val="single" w:sz="4" w:color="D9D9D9"/>
+              <w:bottom w:val="single" w:sz="4" w:color="D9D9D9"/>
+              <w:right w:val="single" w:sz="4" w:color="D9D9D9"/>
+            </w:tcBorders>
+          </w:tcPr>
+          <w:p>
+            <w:pPr>
+              <w:spacing w:after="0" w:before="0" w:line="264" w:lineRule="auto"/>
+              <w:ind w:firstLine="0"/>
+              <w:jc w:val="left"/>
+            </w:pPr>
+            <w:r>
+              <w:rPr>
+                <w:rFonts w:ascii="Times New Roman" w:hAnsi="Times New Roman" w:eastAsia="Songti SC"/>
+                <w:b w:val="0"/>
+                <w:color w:val="000000"/>
+                <w:sz w:val="19"/>
+              </w:rPr>
+              <w:t>自然长尾频率或五核逐一因果贡献</w:t>
             </w:r>
           </w:p>
         </w:tc>
@@ -3520,6 +3999,102 @@
     </w:p>
     <w:p>
       <w:pPr>
+        <w:pStyle w:val="Heading2"/>
+      </w:pPr>
+      <w:r>
+        <w:rPr>
+          <w:rFonts w:ascii="Times New Roman" w:hAnsi="Times New Roman" w:eastAsia="Songti SC"/>
+          <w:color w:val="000000"/>
+        </w:rPr>
+        <w:t>4.6 教学对象交互的补充验证</w:t>
+      </w:r>
+    </w:p>
+    <w:p>
+      <w:pPr>
+        <w:ind w:firstLine="440"/>
+      </w:pPr>
+      <w:r>
+        <w:rPr>
+          <w:rFonts w:ascii="Times New Roman" w:hAnsi="Times New Roman" w:eastAsia="Songti SC"/>
+          <w:color w:val="000000"/>
+        </w:rPr>
+        <w:t>补充研究在隔离内存数据库中构造十四个情境：路径确认、幂等、修订与归档；初次评分生成复习计划；仅到期查看；延期；受助原题、独立原题和独立变式复习；多周原题成功；间隔成功且包含变式；缺失、跳过与不会的区分；重复提交；两种跨周目标与支持条件组合；以及达到规则稳定后再次答错。协议区分已有合同、作者组合挑战和作者安全挑战，最后一类要求当前工作台与未限定的长期stable标记保持一致，不能将失败事后解释为已验证通过。</w:t>
+      </w:r>
+    </w:p>
+    <w:p>
+      <w:pPr>
+        <w:ind w:firstLine="440"/>
+      </w:pPr>
+      <w:r>
+        <w:rPr>
+          <w:rFonts w:ascii="Times New Roman" w:hAnsi="Times New Roman" w:eastAsia="Songti SC"/>
+          <w:color w:val="000000"/>
+        </w:rPr>
+        <w:t>路径通过正式确认、修订和归档API执行。复习从 submit_concept 建立正式Attempt和ReviewSchedule开始，经 get_review_item 获取公开题面与呈现版本，再用 submit_review_item 提交。评价保留每步业务返回、五核投影、Attempt、Event、Mutation和Fact引用；检查只查看或延期时是否新增学习证据，复习是否使用真实呈现版本，以及重复请求是否重复计分。每例加入异项目控制干扰，并检查其他学习者不能读取目标复习项。路径、复习和会话的作用域差异单列，不能由对象ID合法推断整个会话链已被隔离。</w:t>
+      </w:r>
+    </w:p>
+    <w:p>
+      <w:pPr>
+        <w:ind w:firstLine="440"/>
+      </w:pPr>
+      <w:r>
+        <w:rPr>
+          <w:rFonts w:ascii="Times New Roman" w:hAnsi="Times New Roman" w:eastAsia="Songti SC"/>
+          <w:color w:val="000000"/>
+        </w:rPr>
+        <w:t>基础题为 len(range(3))，作者预先验证的变式为 len(range(6))。作答程序根据公开题面计算并选择公开选项，不读取私有答案决定响应；标记为验证变式仅说明本实验题型合同和答案可计算，不代表独立专家确认其迁移难度。同一预置变式可重复呈现，题目新颖性不是本组终点。程序注入相隔十四天的时钟以验证间隔门，不模拟真实人类记忆随时间变化。验证器从保存的原生事件独立计算成功次数、时间跨度及辅助资格，不调用生产稳定判定函数充当答案。全部案例和源码在执行前冻结，失败保留，不以修改产品或标准提高通过率。</w:t>
+      </w:r>
+    </w:p>
+    <w:p>
+      <w:pPr>
+        <w:pStyle w:val="Heading2"/>
+      </w:pPr>
+      <w:r>
+        <w:rPr>
+          <w:rFonts w:ascii="Times New Roman" w:hAnsi="Times New Roman" w:eastAsia="Songti SC"/>
+          <w:color w:val="000000"/>
+        </w:rPr>
+        <w:t>4.7 长历史下的来源交付与局部机制对照</w:t>
+      </w:r>
+    </w:p>
+    <w:p>
+      <w:pPr>
+        <w:ind w:firstLine="440"/>
+      </w:pPr>
+      <w:r>
+        <w:rPr>
+          <w:rFonts w:ascii="Times New Roman" w:hAnsi="Times New Roman" w:eastAsia="Songti SC"/>
+          <w:color w:val="000000"/>
+        </w:rPr>
+        <w:t>新增读取验证包括十二个作者编写的计算机教育情境和十三个查询，覆盖旧稀有事实、别名、唯一与歧义错拼、词表外表达、分离限定、正文尾部、同主题最初与当前、作用域污染和无证据问题。每个情境分别加入4、64、256条后续干扰记录，采用1,800和3,200的产品预算估算单位。干扰来自32种明确披露的计算机学习片段，部分重复并改变练习坐标；同主题历史情境使用同主题干扰。它是有限压力语料，不是从真实学生日志估计出的长尾分布。</w:t>
+      </w:r>
+    </w:p>
+    <w:p>
+      <w:pPr>
+        <w:ind w:firstLine="440"/>
+      </w:pPr>
+      <w:r>
+        <w:rPr>
+          <w:rFonts w:ascii="Times New Roman" w:hAnsi="Times New Roman" w:eastAsia="Songti SC"/>
+          <w:color w:val="000000"/>
+        </w:rPr>
+        <w:t>学习者、项目、检查点等基础对象可以直接创建，但事件及记忆必须经过正式 user_message 事件入口形成，不直接插入Fact。因此，本组主要检验Knowledge自述来源的读取；其他核虽保留默认读取策略，却没有凭空补造相关掌握、支持或目标证据。学习者自述的准确性也不是其来源链有效性所能证明的。对每份形成记录保存所有相关来源；长期事件退出有界短期引用列表，不自动判为历史证据丢失，仍需核验实际Event、Mutation及Fact引用。</w:t>
+      </w:r>
+    </w:p>
+    <w:p>
+      <w:pPr>
+        <w:ind w:firstLine="440"/>
+      </w:pPr>
+      <w:r>
+        <w:rPr>
+          <w:rFonts w:ascii="Times New Roman" w:hAnsi="Times New Roman" w:eastAsia="Songti SC"/>
+          <w:color w:val="000000"/>
+        </w:rPr>
+        <w:t>共同对照为当前默认读取与启用来源正文读取；后者同时扩大候选扫描并增加来源元数据，解释为组合读取配置。别名、错拼、时间任务另在两种配置内关闭对应开关，形成局部机制对照。所有条件从相同数据库读取，保留默认五核读取面、条目和路径上限，仅改变声明因素及预算。结果分别报告目标来源候选可用、最终事实交付、目标与限定共同交付、范围泄漏、预算和无证据时的背景误召回；不将无目标标注命中直接称为正确拒答。模型回答、真实教学动作与学习增益不在本组终点中，局部开关结果也不是五核逐核移除消融。</w:t>
+      </w:r>
+    </w:p>
+    <w:p>
+      <w:pPr>
         <w:pStyle w:val="Heading1"/>
       </w:pPr>
       <w:r>
@@ -3563,7 +4138,7 @@
           <w:rFonts w:ascii="Times New Roman" w:hAnsi="Times New Roman" w:eastAsia="Songti SC"/>
           <w:color w:val="000000"/>
         </w:rPr>
-        <w:t>这些结果证明部分状态转换和消费者规则，而不是估计五核预测准确率。十五个案例全部通过只说明所列输入边界满足预期；未覆盖的多周演化、跨端最终提示词、正向稳定掌握及真实课堂结果仍需单独验证。</w:t>
+        <w:t>这些结果证明部分状态转换和消费者规则，而不是估计五核预测准确率。十五个案例全部通过只说明所列输入边界满足预期，不能将其扩展为多周演化或正向稳定掌握验证。后文新增对象交互测试专门检查这些规则的部分时间边界；真实课堂结果仍未测量。</w:t>
       </w:r>
     </w:p>
     <w:p>
@@ -5550,7 +6125,7 @@
         <w:drawing>
           <wp:inline xmlns:a="http://schemas.openxmlformats.org/drawingml/2006/main" xmlns:pic="http://schemas.openxmlformats.org/drawingml/2006/picture">
             <wp:extent cx="6156000" cy="2693250"/>
-            <wp:docPr id="2" name="Picture 2"/>
+            <wp:docPr id="3" name="Picture 3"/>
             <wp:cNvGraphicFramePr>
               <a:graphicFrameLocks noChangeAspect="1"/>
             </wp:cNvGraphicFramePr>
@@ -5559,71 +6134,6 @@
                 <pic:pic>
                   <pic:nvPicPr>
                     <pic:cNvPr id="0" name="results.png"/>
-                    <pic:cNvPicPr/>
-                  </pic:nvPicPr>
-                  <pic:blipFill>
-                    <a:blip r:embed="rId12"/>
-                    <a:stretch>
-                      <a:fillRect/>
-                    </a:stretch>
-                  </pic:blipFill>
-                  <pic:spPr>
-                    <a:xfrm>
-                      <a:off x="0" y="0"/>
-                      <a:ext cx="6156000" cy="2693250"/>
-                    </a:xfrm>
-                    <a:prstGeom prst="rect"/>
-                  </pic:spPr>
-                </pic:pic>
-              </a:graphicData>
-            </a:graphic>
-          </wp:inline>
-        </w:drawing>
-      </w:r>
-    </w:p>
-    <w:p>
-      <w:pPr>
-        <w:pStyle w:val="Caption"/>
-        <w:keepNext w:val="0"/>
-      </w:pPr>
-      <w:r>
-        <w:rPr>
-          <w:rFonts w:ascii="Times New Roman" w:hAnsi="Times New Roman" w:eastAsia="Songti SC"/>
-          <w:color w:val="000000"/>
-        </w:rPr>
-        <w:t>图2 完整操作一致性与反事实成对成功。点值直接由冻结聚合文件生成，分子和分母见表4；两预算分别使用96条相同轨迹和48对。未绘制不存在的独立重复运行误差棒。图示仅描述该合成样本与单个托管模型 alias。</w:t>
-      </w:r>
-    </w:p>
-    <w:p>
-      <w:pPr>
-        <w:ind w:firstLine="440"/>
-      </w:pPr>
-      <w:r>
-        <w:rPr>
-          <w:rFonts w:ascii="Times New Roman" w:hAnsi="Times New Roman" w:eastAsia="Songti SC"/>
-          <w:color w:val="000000"/>
-        </w:rPr>
-        <w:t>仅来源条件下，五核相对平面的完整正确率差为+57.29和+48.96个百分点。加入相同资格注释后，差异缩小并在严格计分下变为−2.08和−3.13个百分点，其主题簇区间分别为[−5.21,0.00]和[−7.29,+3.13]。在五核内增加资格注释的差异为+20.83和+16.67个百分点，在平面内为+80.21和+68.75个百分点。组织与资格信息存在明显交互，不能仅选取仅来源条件的巨大差距作为五核全面优势。</w:t>
-      </w:r>
-    </w:p>
-    <w:p>
-      <w:pPr>
-        <w:keepNext/>
-        <w:jc w:val="center"/>
-      </w:pPr>
-      <w:r>
-        <w:drawing>
-          <wp:inline xmlns:a="http://schemas.openxmlformats.org/drawingml/2006/main" xmlns:pic="http://schemas.openxmlformats.org/drawingml/2006/picture">
-            <wp:extent cx="6156000" cy="2693250"/>
-            <wp:docPr id="3" name="Picture 3"/>
-            <wp:cNvGraphicFramePr>
-              <a:graphicFrameLocks noChangeAspect="1"/>
-            </wp:cNvGraphicFramePr>
-            <a:graphic>
-              <a:graphicData uri="http://schemas.openxmlformats.org/drawingml/2006/picture">
-                <pic:pic>
-                  <pic:nvPicPr>
-                    <pic:cNvPr id="0" name="effects.png"/>
                     <pic:cNvPicPr/>
                   </pic:nvPicPr>
                   <pic:blipFill>
@@ -5656,7 +6166,72 @@
           <w:rFonts w:ascii="Times New Roman" w:hAnsi="Times New Roman" w:eastAsia="Songti SC"/>
           <w:color w:val="000000"/>
         </w:rPr>
-        <w:t>图3 完整操作一致性的配对差异。Grouping表示五核减平面，Eligibility表示加资格注释减仅来源。区间按八个作者生成主题簇计算，仅作探索性描述。横轴单位为百分点，分组的细小差异还受到下述输出契约影响。</w:t>
+        <w:t>图3 完整操作一致性与反事实成对成功。点值直接由冻结聚合文件生成，分子和分母见表4；两预算分别使用96条相同轨迹和48对。未绘制不存在的独立重复运行误差棒。图示仅描述该合成样本与单个托管模型 alias。</w:t>
+      </w:r>
+    </w:p>
+    <w:p>
+      <w:pPr>
+        <w:ind w:firstLine="440"/>
+      </w:pPr>
+      <w:r>
+        <w:rPr>
+          <w:rFonts w:ascii="Times New Roman" w:hAnsi="Times New Roman" w:eastAsia="Songti SC"/>
+          <w:color w:val="000000"/>
+        </w:rPr>
+        <w:t>仅来源条件下，五核相对平面的完整正确率差为+57.29和+48.96个百分点。加入相同资格注释后，差异缩小并在严格计分下变为−2.08和−3.13个百分点，其主题簇区间分别为[−5.21,0.00]和[−7.29,+3.13]。在五核内增加资格注释的差异为+20.83和+16.67个百分点，在平面内为+80.21和+68.75个百分点。组织与资格信息存在明显交互，不能仅选取仅来源条件的巨大差距作为五核全面优势。</w:t>
+      </w:r>
+    </w:p>
+    <w:p>
+      <w:pPr>
+        <w:keepNext/>
+        <w:jc w:val="center"/>
+      </w:pPr>
+      <w:r>
+        <w:drawing>
+          <wp:inline xmlns:a="http://schemas.openxmlformats.org/drawingml/2006/main" xmlns:pic="http://schemas.openxmlformats.org/drawingml/2006/picture">
+            <wp:extent cx="6156000" cy="2693250"/>
+            <wp:docPr id="4" name="Picture 4"/>
+            <wp:cNvGraphicFramePr>
+              <a:graphicFrameLocks noChangeAspect="1"/>
+            </wp:cNvGraphicFramePr>
+            <a:graphic>
+              <a:graphicData uri="http://schemas.openxmlformats.org/drawingml/2006/picture">
+                <pic:pic>
+                  <pic:nvPicPr>
+                    <pic:cNvPr id="0" name="effects.png"/>
+                    <pic:cNvPicPr/>
+                  </pic:nvPicPr>
+                  <pic:blipFill>
+                    <a:blip r:embed="rId14"/>
+                    <a:stretch>
+                      <a:fillRect/>
+                    </a:stretch>
+                  </pic:blipFill>
+                  <pic:spPr>
+                    <a:xfrm>
+                      <a:off x="0" y="0"/>
+                      <a:ext cx="6156000" cy="2693250"/>
+                    </a:xfrm>
+                    <a:prstGeom prst="rect"/>
+                  </pic:spPr>
+                </pic:pic>
+              </a:graphicData>
+            </a:graphic>
+          </wp:inline>
+        </w:drawing>
+      </w:r>
+    </w:p>
+    <w:p>
+      <w:pPr>
+        <w:pStyle w:val="Caption"/>
+        <w:keepNext w:val="0"/>
+      </w:pPr>
+      <w:r>
+        <w:rPr>
+          <w:rFonts w:ascii="Times New Roman" w:hAnsi="Times New Roman" w:eastAsia="Songti SC"/>
+          <w:color w:val="000000"/>
+        </w:rPr>
+        <w:t>图4 完整操作一致性的配对差异。Grouping表示五核减平面，Eligibility表示加资格注释减仅来源。区间按八个作者生成主题簇计算，仅作探索性描述。横轴单位为百分点，分组的细小差异还受到下述输出契约影响。</w:t>
       </w:r>
     </w:p>
     <w:p>
@@ -6872,6 +7447,2318 @@
     </w:p>
     <w:p>
       <w:pPr>
+        <w:pStyle w:val="Heading2"/>
+      </w:pPr>
+      <w:r>
+        <w:rPr>
+          <w:rFonts w:ascii="Times New Roman" w:hAnsi="Times New Roman" w:eastAsia="Songti SC"/>
+          <w:color w:val="000000"/>
+        </w:rPr>
+        <w:t>5.6 教学对象交互与状态失效</w:t>
+      </w:r>
+    </w:p>
+    <w:p>
+      <w:pPr>
+        <w:ind w:firstLine="440"/>
+      </w:pPr>
+      <w:r>
+        <w:rPr>
+          <w:rFonts w:ascii="Times New Roman" w:hAnsi="Times New Roman" w:eastAsia="Songti SC"/>
+          <w:color w:val="000000"/>
+        </w:rPr>
+        <w:t>补充交互验证的十四个情境均完成全部业务步骤，无基础设施错误。正式第二轮中13/14个情境通过，80项具体断言中79项通过，全部来源门通过；分类结果见表6。真实形成60条Events、27条Attempts、13条ReviewSchedules、121条Mutations与247条Facts及对应节点。27条正式评估事件均未绑定session，原值保留；这项覆盖限制没有由评测补写字段掩盖。</w:t>
+      </w:r>
+    </w:p>
+    <w:p>
+      <w:pPr>
+        <w:pStyle w:val="Caption"/>
+        <w:keepNext/>
+      </w:pPr>
+      <w:r>
+        <w:rPr>
+          <w:rFonts w:ascii="Times New Roman" w:hAnsi="Times New Roman" w:eastAsia="Songti SC"/>
+          <w:color w:val="000000"/>
+        </w:rPr>
+        <w:t>表6 对象交互补充验证的分类结果</w:t>
+      </w:r>
+    </w:p>
+    <w:tbl>
+      <w:tblPr>
+        <w:tblW w:type="auto" w:w="0"/>
+        <w:jc w:val="center"/>
+        <w:tblLayout w:type="fixed"/>
+        <w:tblLook w:firstColumn="1" w:firstRow="1" w:lastColumn="0" w:lastRow="0" w:noHBand="0" w:noVBand="1" w:val="04A0"/>
+      </w:tblPr>
+      <w:tblGrid>
+        <w:gridCol w:w="1389"/>
+        <w:gridCol w:w="2466"/>
+        <w:gridCol w:w="2920"/>
+        <w:gridCol w:w="2971"/>
+      </w:tblGrid>
+      <w:tr>
+        <w:trPr>
+          <w:cantSplit/>
+          <w:tblHeader/>
+        </w:trPr>
+        <w:tc>
+          <w:tcPr>
+            <w:tcW w:type="dxa" w:w="1389"/>
+            <w:vAlign w:val="center"/>
+            <w:tcMar>
+              <w:top w:w="75" w:type="dxa"/>
+              <w:bottom w:w="75" w:type="dxa"/>
+              <w:left w:w="75" w:type="dxa"/>
+              <w:right w:w="75" w:type="dxa"/>
+            </w:tcMar>
+            <w:tcBorders>
+              <w:top w:val="single" w:sz="4" w:color="D9D9D9"/>
+              <w:left w:val="single" w:sz="4" w:color="D9D9D9"/>
+              <w:bottom w:val="single" w:sz="4" w:color="D9D9D9"/>
+              <w:right w:val="single" w:sz="4" w:color="D9D9D9"/>
+            </w:tcBorders>
+            <w:shd w:fill="F1F2F3"/>
+          </w:tcPr>
+          <w:p>
+            <w:pPr>
+              <w:spacing w:after="0" w:before="0" w:line="264" w:lineRule="auto"/>
+              <w:ind w:firstLine="0"/>
+              <w:jc w:val="left"/>
+            </w:pPr>
+            <w:r>
+              <w:rPr>
+                <w:rFonts w:ascii="Times New Roman" w:hAnsi="Times New Roman" w:eastAsia="Songti SC"/>
+                <w:b/>
+                <w:color w:val="000000"/>
+                <w:sz w:val="19"/>
+              </w:rPr>
+              <w:t>情境类别</w:t>
+            </w:r>
+          </w:p>
+        </w:tc>
+        <w:tc>
+          <w:tcPr>
+            <w:tcW w:type="dxa" w:w="2466"/>
+            <w:vAlign w:val="center"/>
+            <w:tcMar>
+              <w:top w:w="75" w:type="dxa"/>
+              <w:bottom w:w="75" w:type="dxa"/>
+              <w:left w:w="75" w:type="dxa"/>
+              <w:right w:w="75" w:type="dxa"/>
+            </w:tcMar>
+            <w:tcBorders>
+              <w:top w:val="single" w:sz="4" w:color="D9D9D9"/>
+              <w:left w:val="single" w:sz="4" w:color="D9D9D9"/>
+              <w:bottom w:val="single" w:sz="4" w:color="D9D9D9"/>
+              <w:right w:val="single" w:sz="4" w:color="D9D9D9"/>
+            </w:tcBorders>
+            <w:shd w:fill="F1F2F3"/>
+          </w:tcPr>
+          <w:p>
+            <w:pPr>
+              <w:spacing w:after="0" w:before="0" w:line="264" w:lineRule="auto"/>
+              <w:ind w:firstLine="0"/>
+              <w:jc w:val="left"/>
+            </w:pPr>
+            <w:r>
+              <w:rPr>
+                <w:rFonts w:ascii="Times New Roman" w:hAnsi="Times New Roman" w:eastAsia="Songti SC"/>
+                <w:b/>
+                <w:color w:val="000000"/>
+                <w:sz w:val="19"/>
+              </w:rPr>
+              <w:t>完整通过</w:t>
+            </w:r>
+          </w:p>
+        </w:tc>
+        <w:tc>
+          <w:tcPr>
+            <w:tcW w:type="dxa" w:w="2920"/>
+            <w:vAlign w:val="center"/>
+            <w:tcMar>
+              <w:top w:w="75" w:type="dxa"/>
+              <w:bottom w:w="75" w:type="dxa"/>
+              <w:left w:w="75" w:type="dxa"/>
+              <w:right w:w="75" w:type="dxa"/>
+            </w:tcMar>
+            <w:tcBorders>
+              <w:top w:val="single" w:sz="4" w:color="D9D9D9"/>
+              <w:left w:val="single" w:sz="4" w:color="D9D9D9"/>
+              <w:bottom w:val="single" w:sz="4" w:color="D9D9D9"/>
+              <w:right w:val="single" w:sz="4" w:color="D9D9D9"/>
+            </w:tcBorders>
+            <w:shd w:fill="F1F2F3"/>
+          </w:tcPr>
+          <w:p>
+            <w:pPr>
+              <w:spacing w:after="0" w:before="0" w:line="264" w:lineRule="auto"/>
+              <w:ind w:firstLine="0"/>
+              <w:jc w:val="left"/>
+            </w:pPr>
+            <w:r>
+              <w:rPr>
+                <w:rFonts w:ascii="Times New Roman" w:hAnsi="Times New Roman" w:eastAsia="Songti SC"/>
+                <w:b/>
+                <w:color w:val="000000"/>
+                <w:sz w:val="19"/>
+              </w:rPr>
+              <w:t>实际检查</w:t>
+            </w:r>
+          </w:p>
+        </w:tc>
+        <w:tc>
+          <w:tcPr>
+            <w:tcW w:type="dxa" w:w="2971"/>
+            <w:vAlign w:val="center"/>
+            <w:tcMar>
+              <w:top w:w="75" w:type="dxa"/>
+              <w:bottom w:w="75" w:type="dxa"/>
+              <w:left w:w="75" w:type="dxa"/>
+              <w:right w:w="75" w:type="dxa"/>
+            </w:tcMar>
+            <w:tcBorders>
+              <w:top w:val="single" w:sz="4" w:color="D9D9D9"/>
+              <w:left w:val="single" w:sz="4" w:color="D9D9D9"/>
+              <w:bottom w:val="single" w:sz="4" w:color="D9D9D9"/>
+              <w:right w:val="single" w:sz="4" w:color="D9D9D9"/>
+            </w:tcBorders>
+            <w:shd w:fill="F1F2F3"/>
+          </w:tcPr>
+          <w:p>
+            <w:pPr>
+              <w:spacing w:after="0" w:before="0" w:line="264" w:lineRule="auto"/>
+              <w:ind w:firstLine="0"/>
+              <w:jc w:val="left"/>
+            </w:pPr>
+            <w:r>
+              <w:rPr>
+                <w:rFonts w:ascii="Times New Roman" w:hAnsi="Times New Roman" w:eastAsia="Songti SC"/>
+                <w:b/>
+                <w:color w:val="000000"/>
+                <w:sz w:val="19"/>
+              </w:rPr>
+              <w:t>未通过项</w:t>
+            </w:r>
+          </w:p>
+        </w:tc>
+      </w:tr>
+      <w:tr>
+        <w:trPr>
+          <w:cantSplit/>
+        </w:trPr>
+        <w:tc>
+          <w:tcPr>
+            <w:tcW w:type="dxa" w:w="1389"/>
+            <w:vAlign w:val="center"/>
+            <w:tcMar>
+              <w:top w:w="75" w:type="dxa"/>
+              <w:bottom w:w="75" w:type="dxa"/>
+              <w:left w:w="75" w:type="dxa"/>
+              <w:right w:w="75" w:type="dxa"/>
+            </w:tcMar>
+            <w:tcBorders>
+              <w:top w:val="single" w:sz="4" w:color="D9D9D9"/>
+              <w:left w:val="single" w:sz="4" w:color="D9D9D9"/>
+              <w:bottom w:val="single" w:sz="4" w:color="D9D9D9"/>
+              <w:right w:val="single" w:sz="4" w:color="D9D9D9"/>
+            </w:tcBorders>
+          </w:tcPr>
+          <w:p>
+            <w:pPr>
+              <w:spacing w:after="0" w:before="0" w:line="264" w:lineRule="auto"/>
+              <w:ind w:firstLine="0"/>
+              <w:jc w:val="left"/>
+            </w:pPr>
+            <w:r>
+              <w:rPr>
+                <w:rFonts w:ascii="Times New Roman" w:hAnsi="Times New Roman" w:eastAsia="Songti SC"/>
+                <w:b w:val="0"/>
+                <w:color w:val="000000"/>
+                <w:sz w:val="19"/>
+              </w:rPr>
+              <w:t>既有业务合同</w:t>
+            </w:r>
+          </w:p>
+        </w:tc>
+        <w:tc>
+          <w:tcPr>
+            <w:tcW w:type="dxa" w:w="2466"/>
+            <w:vAlign w:val="center"/>
+            <w:tcMar>
+              <w:top w:w="75" w:type="dxa"/>
+              <w:bottom w:w="75" w:type="dxa"/>
+              <w:left w:w="75" w:type="dxa"/>
+              <w:right w:w="75" w:type="dxa"/>
+            </w:tcMar>
+            <w:tcBorders>
+              <w:top w:val="single" w:sz="4" w:color="D9D9D9"/>
+              <w:left w:val="single" w:sz="4" w:color="D9D9D9"/>
+              <w:bottom w:val="single" w:sz="4" w:color="D9D9D9"/>
+              <w:right w:val="single" w:sz="4" w:color="D9D9D9"/>
+            </w:tcBorders>
+          </w:tcPr>
+          <w:p>
+            <w:pPr>
+              <w:spacing w:after="0" w:before="0" w:line="264" w:lineRule="auto"/>
+              <w:ind w:firstLine="0"/>
+              <w:jc w:val="left"/>
+            </w:pPr>
+            <w:r>
+              <w:rPr>
+                <w:rFonts w:ascii="Times New Roman" w:hAnsi="Times New Roman" w:eastAsia="Songti SC"/>
+                <w:b w:val="0"/>
+                <w:color w:val="000000"/>
+                <w:sz w:val="19"/>
+              </w:rPr>
+              <w:t>11/11</w:t>
+            </w:r>
+          </w:p>
+        </w:tc>
+        <w:tc>
+          <w:tcPr>
+            <w:tcW w:type="dxa" w:w="2920"/>
+            <w:vAlign w:val="center"/>
+            <w:tcMar>
+              <w:top w:w="75" w:type="dxa"/>
+              <w:bottom w:w="75" w:type="dxa"/>
+              <w:left w:w="75" w:type="dxa"/>
+              <w:right w:w="75" w:type="dxa"/>
+            </w:tcMar>
+            <w:tcBorders>
+              <w:top w:val="single" w:sz="4" w:color="D9D9D9"/>
+              <w:left w:val="single" w:sz="4" w:color="D9D9D9"/>
+              <w:bottom w:val="single" w:sz="4" w:color="D9D9D9"/>
+              <w:right w:val="single" w:sz="4" w:color="D9D9D9"/>
+            </w:tcBorders>
+          </w:tcPr>
+          <w:p>
+            <w:pPr>
+              <w:spacing w:after="0" w:before="0" w:line="264" w:lineRule="auto"/>
+              <w:ind w:firstLine="0"/>
+              <w:jc w:val="left"/>
+            </w:pPr>
+            <w:r>
+              <w:rPr>
+                <w:rFonts w:ascii="Times New Roman" w:hAnsi="Times New Roman" w:eastAsia="Songti SC"/>
+                <w:b w:val="0"/>
+                <w:color w:val="000000"/>
+                <w:sz w:val="19"/>
+              </w:rPr>
+              <w:t>路径修订归档、调度形成、延期、作答类型、间隔门与幂等</w:t>
+            </w:r>
+          </w:p>
+        </w:tc>
+        <w:tc>
+          <w:tcPr>
+            <w:tcW w:type="dxa" w:w="2971"/>
+            <w:vAlign w:val="center"/>
+            <w:tcMar>
+              <w:top w:w="75" w:type="dxa"/>
+              <w:bottom w:w="75" w:type="dxa"/>
+              <w:left w:w="75" w:type="dxa"/>
+              <w:right w:w="75" w:type="dxa"/>
+            </w:tcMar>
+            <w:tcBorders>
+              <w:top w:val="single" w:sz="4" w:color="D9D9D9"/>
+              <w:left w:val="single" w:sz="4" w:color="D9D9D9"/>
+              <w:bottom w:val="single" w:sz="4" w:color="D9D9D9"/>
+              <w:right w:val="single" w:sz="4" w:color="D9D9D9"/>
+            </w:tcBorders>
+          </w:tcPr>
+          <w:p>
+            <w:pPr>
+              <w:spacing w:after="0" w:before="0" w:line="264" w:lineRule="auto"/>
+              <w:ind w:firstLine="0"/>
+              <w:jc w:val="left"/>
+            </w:pPr>
+            <w:r>
+              <w:rPr>
+                <w:rFonts w:ascii="Times New Roman" w:hAnsi="Times New Roman" w:eastAsia="Songti SC"/>
+                <w:b w:val="0"/>
+                <w:color w:val="000000"/>
+                <w:sz w:val="19"/>
+              </w:rPr>
+              <w:t>无</w:t>
+            </w:r>
+          </w:p>
+        </w:tc>
+      </w:tr>
+      <w:tr>
+        <w:trPr>
+          <w:cantSplit/>
+        </w:trPr>
+        <w:tc>
+          <w:tcPr>
+            <w:tcW w:type="dxa" w:w="1389"/>
+            <w:vAlign w:val="center"/>
+            <w:tcMar>
+              <w:top w:w="75" w:type="dxa"/>
+              <w:bottom w:w="75" w:type="dxa"/>
+              <w:left w:w="75" w:type="dxa"/>
+              <w:right w:w="75" w:type="dxa"/>
+            </w:tcMar>
+            <w:tcBorders>
+              <w:top w:val="single" w:sz="4" w:color="D9D9D9"/>
+              <w:left w:val="single" w:sz="4" w:color="D9D9D9"/>
+              <w:bottom w:val="single" w:sz="4" w:color="D9D9D9"/>
+              <w:right w:val="single" w:sz="4" w:color="D9D9D9"/>
+            </w:tcBorders>
+          </w:tcPr>
+          <w:p>
+            <w:pPr>
+              <w:spacing w:after="0" w:before="0" w:line="264" w:lineRule="auto"/>
+              <w:ind w:firstLine="0"/>
+              <w:jc w:val="left"/>
+            </w:pPr>
+            <w:r>
+              <w:rPr>
+                <w:rFonts w:ascii="Times New Roman" w:hAnsi="Times New Roman" w:eastAsia="Songti SC"/>
+                <w:b w:val="0"/>
+                <w:color w:val="000000"/>
+                <w:sz w:val="19"/>
+              </w:rPr>
+              <w:t>作者组合边界</w:t>
+            </w:r>
+          </w:p>
+        </w:tc>
+        <w:tc>
+          <w:tcPr>
+            <w:tcW w:type="dxa" w:w="2466"/>
+            <w:vAlign w:val="center"/>
+            <w:tcMar>
+              <w:top w:w="75" w:type="dxa"/>
+              <w:bottom w:w="75" w:type="dxa"/>
+              <w:left w:w="75" w:type="dxa"/>
+              <w:right w:w="75" w:type="dxa"/>
+            </w:tcMar>
+            <w:tcBorders>
+              <w:top w:val="single" w:sz="4" w:color="D9D9D9"/>
+              <w:left w:val="single" w:sz="4" w:color="D9D9D9"/>
+              <w:bottom w:val="single" w:sz="4" w:color="D9D9D9"/>
+              <w:right w:val="single" w:sz="4" w:color="D9D9D9"/>
+            </w:tcBorders>
+          </w:tcPr>
+          <w:p>
+            <w:pPr>
+              <w:spacing w:after="0" w:before="0" w:line="264" w:lineRule="auto"/>
+              <w:ind w:firstLine="0"/>
+              <w:jc w:val="left"/>
+            </w:pPr>
+            <w:r>
+              <w:rPr>
+                <w:rFonts w:ascii="Times New Roman" w:hAnsi="Times New Roman" w:eastAsia="Songti SC"/>
+                <w:b w:val="0"/>
+                <w:color w:val="000000"/>
+                <w:sz w:val="19"/>
+              </w:rPr>
+              <w:t>2/2</w:t>
+            </w:r>
+          </w:p>
+        </w:tc>
+        <w:tc>
+          <w:tcPr>
+            <w:tcW w:type="dxa" w:w="2920"/>
+            <w:vAlign w:val="center"/>
+            <w:tcMar>
+              <w:top w:w="75" w:type="dxa"/>
+              <w:bottom w:w="75" w:type="dxa"/>
+              <w:left w:w="75" w:type="dxa"/>
+              <w:right w:w="75" w:type="dxa"/>
+            </w:tcMar>
+            <w:tcBorders>
+              <w:top w:val="single" w:sz="4" w:color="D9D9D9"/>
+              <w:left w:val="single" w:sz="4" w:color="D9D9D9"/>
+              <w:bottom w:val="single" w:sz="4" w:color="D9D9D9"/>
+              <w:right w:val="single" w:sz="4" w:color="D9D9D9"/>
+            </w:tcBorders>
+          </w:tcPr>
+          <w:p>
+            <w:pPr>
+              <w:spacing w:after="0" w:before="0" w:line="264" w:lineRule="auto"/>
+              <w:ind w:firstLine="0"/>
+              <w:jc w:val="left"/>
+            </w:pPr>
+            <w:r>
+              <w:rPr>
+                <w:rFonts w:ascii="Times New Roman" w:hAnsi="Times New Roman" w:eastAsia="Songti SC"/>
+                <w:b w:val="0"/>
+                <w:color w:val="000000"/>
+                <w:sz w:val="19"/>
+              </w:rPr>
+              <w:t>跨周目标修订、旧控制过期、当期支持与异项目干扰</w:t>
+            </w:r>
+          </w:p>
+        </w:tc>
+        <w:tc>
+          <w:tcPr>
+            <w:tcW w:type="dxa" w:w="2971"/>
+            <w:vAlign w:val="center"/>
+            <w:tcMar>
+              <w:top w:w="75" w:type="dxa"/>
+              <w:bottom w:w="75" w:type="dxa"/>
+              <w:left w:w="75" w:type="dxa"/>
+              <w:right w:w="75" w:type="dxa"/>
+            </w:tcMar>
+            <w:tcBorders>
+              <w:top w:val="single" w:sz="4" w:color="D9D9D9"/>
+              <w:left w:val="single" w:sz="4" w:color="D9D9D9"/>
+              <w:bottom w:val="single" w:sz="4" w:color="D9D9D9"/>
+              <w:right w:val="single" w:sz="4" w:color="D9D9D9"/>
+            </w:tcBorders>
+          </w:tcPr>
+          <w:p>
+            <w:pPr>
+              <w:spacing w:after="0" w:before="0" w:line="264" w:lineRule="auto"/>
+              <w:ind w:firstLine="0"/>
+              <w:jc w:val="left"/>
+            </w:pPr>
+            <w:r>
+              <w:rPr>
+                <w:rFonts w:ascii="Times New Roman" w:hAnsi="Times New Roman" w:eastAsia="Songti SC"/>
+                <w:b w:val="0"/>
+                <w:color w:val="000000"/>
+                <w:sz w:val="19"/>
+              </w:rPr>
+              <w:t>无</w:t>
+            </w:r>
+          </w:p>
+        </w:tc>
+      </w:tr>
+      <w:tr>
+        <w:trPr>
+          <w:cantSplit/>
+        </w:trPr>
+        <w:tc>
+          <w:tcPr>
+            <w:tcW w:type="dxa" w:w="1389"/>
+            <w:vAlign w:val="center"/>
+            <w:tcMar>
+              <w:top w:w="75" w:type="dxa"/>
+              <w:bottom w:w="75" w:type="dxa"/>
+              <w:left w:w="75" w:type="dxa"/>
+              <w:right w:w="75" w:type="dxa"/>
+            </w:tcMar>
+            <w:tcBorders>
+              <w:top w:val="single" w:sz="4" w:color="D9D9D9"/>
+              <w:left w:val="single" w:sz="4" w:color="D9D9D9"/>
+              <w:bottom w:val="single" w:sz="4" w:color="D9D9D9"/>
+              <w:right w:val="single" w:sz="4" w:color="D9D9D9"/>
+            </w:tcBorders>
+          </w:tcPr>
+          <w:p>
+            <w:pPr>
+              <w:spacing w:after="0" w:before="0" w:line="264" w:lineRule="auto"/>
+              <w:ind w:firstLine="0"/>
+              <w:jc w:val="left"/>
+            </w:pPr>
+            <w:r>
+              <w:rPr>
+                <w:rFonts w:ascii="Times New Roman" w:hAnsi="Times New Roman" w:eastAsia="Songti SC"/>
+                <w:b w:val="0"/>
+                <w:color w:val="000000"/>
+                <w:sz w:val="19"/>
+              </w:rPr>
+              <w:t>作者状态失效挑战</w:t>
+            </w:r>
+          </w:p>
+        </w:tc>
+        <w:tc>
+          <w:tcPr>
+            <w:tcW w:type="dxa" w:w="2466"/>
+            <w:vAlign w:val="center"/>
+            <w:tcMar>
+              <w:top w:w="75" w:type="dxa"/>
+              <w:bottom w:w="75" w:type="dxa"/>
+              <w:left w:w="75" w:type="dxa"/>
+              <w:right w:w="75" w:type="dxa"/>
+            </w:tcMar>
+            <w:tcBorders>
+              <w:top w:val="single" w:sz="4" w:color="D9D9D9"/>
+              <w:left w:val="single" w:sz="4" w:color="D9D9D9"/>
+              <w:bottom w:val="single" w:sz="4" w:color="D9D9D9"/>
+              <w:right w:val="single" w:sz="4" w:color="D9D9D9"/>
+            </w:tcBorders>
+          </w:tcPr>
+          <w:p>
+            <w:pPr>
+              <w:spacing w:after="0" w:before="0" w:line="264" w:lineRule="auto"/>
+              <w:ind w:firstLine="0"/>
+              <w:jc w:val="left"/>
+            </w:pPr>
+            <w:r>
+              <w:rPr>
+                <w:rFonts w:ascii="Times New Roman" w:hAnsi="Times New Roman" w:eastAsia="Songti SC"/>
+                <w:b w:val="0"/>
+                <w:color w:val="000000"/>
+                <w:sz w:val="19"/>
+              </w:rPr>
+              <w:t>0/1</w:t>
+            </w:r>
+          </w:p>
+        </w:tc>
+        <w:tc>
+          <w:tcPr>
+            <w:tcW w:type="dxa" w:w="2920"/>
+            <w:vAlign w:val="center"/>
+            <w:tcMar>
+              <w:top w:w="75" w:type="dxa"/>
+              <w:bottom w:w="75" w:type="dxa"/>
+              <w:left w:w="75" w:type="dxa"/>
+              <w:right w:w="75" w:type="dxa"/>
+            </w:tcMar>
+            <w:tcBorders>
+              <w:top w:val="single" w:sz="4" w:color="D9D9D9"/>
+              <w:left w:val="single" w:sz="4" w:color="D9D9D9"/>
+              <w:bottom w:val="single" w:sz="4" w:color="D9D9D9"/>
+              <w:right w:val="single" w:sz="4" w:color="D9D9D9"/>
+            </w:tcBorders>
+          </w:tcPr>
+          <w:p>
+            <w:pPr>
+              <w:spacing w:after="0" w:before="0" w:line="264" w:lineRule="auto"/>
+              <w:ind w:firstLine="0"/>
+              <w:jc w:val="left"/>
+            </w:pPr>
+            <w:r>
+              <w:rPr>
+                <w:rFonts w:ascii="Times New Roman" w:hAnsi="Times New Roman" w:eastAsia="Songti SC"/>
+                <w:b w:val="0"/>
+                <w:color w:val="000000"/>
+                <w:sz w:val="19"/>
+              </w:rPr>
+              <w:t>达到规则稳定后再次答错，当前与长期状态一致性</w:t>
+            </w:r>
+          </w:p>
+        </w:tc>
+        <w:tc>
+          <w:tcPr>
+            <w:tcW w:type="dxa" w:w="2971"/>
+            <w:vAlign w:val="center"/>
+            <w:tcMar>
+              <w:top w:w="75" w:type="dxa"/>
+              <w:bottom w:w="75" w:type="dxa"/>
+              <w:left w:w="75" w:type="dxa"/>
+              <w:right w:w="75" w:type="dxa"/>
+            </w:tcMar>
+            <w:tcBorders>
+              <w:top w:val="single" w:sz="4" w:color="D9D9D9"/>
+              <w:left w:val="single" w:sz="4" w:color="D9D9D9"/>
+              <w:bottom w:val="single" w:sz="4" w:color="D9D9D9"/>
+              <w:right w:val="single" w:sz="4" w:color="D9D9D9"/>
+            </w:tcBorders>
+          </w:tcPr>
+          <w:p>
+            <w:pPr>
+              <w:spacing w:after="0" w:before="0" w:line="264" w:lineRule="auto"/>
+              <w:ind w:firstLine="0"/>
+              <w:jc w:val="left"/>
+            </w:pPr>
+            <w:r>
+              <w:rPr>
+                <w:rFonts w:ascii="Times New Roman" w:hAnsi="Times New Roman" w:eastAsia="Songti SC"/>
+                <w:b w:val="0"/>
+                <w:color w:val="000000"/>
+                <w:sz w:val="19"/>
+              </w:rPr>
+              <w:t>长期stable标记仍存在</w:t>
+            </w:r>
+          </w:p>
+        </w:tc>
+      </w:tr>
+    </w:tbl>
+    <w:p>
+      <w:pPr>
+        <w:spacing w:after="40" w:before="0" w:line="240" w:lineRule="auto"/>
+      </w:pPr>
+      <w:r>
+        <w:rPr>
+          <w:sz w:val="4"/>
+        </w:rPr>
+      </w:r>
+    </w:p>
+    <w:p>
+      <w:pPr>
+        <w:ind w:firstLine="440"/>
+      </w:pPr>
+      <w:r>
+        <w:rPr>
+          <w:rFonts w:ascii="Times New Roman" w:hAnsi="Times New Roman" w:eastAsia="Songti SC"/>
+          <w:color w:val="000000"/>
+        </w:rPr>
+        <w:t>这些结果具体说明了五核与工作台之间的交互：路径确认、修订和归档更新Structure与Value；评分形成Practice表现与Knowledge证据，同时创建可操作的复习安排；仅查看到期题、延期或跳过不增加成功证据；受助原题、独立原题、验证变式影响不同证据字段和后续安排。两个跨周组合情境中，真实规划消费者使用当前控制而非过期控制，并排除异项目优先项。它们验证了所列组合规则，没有检验稀有自然语言意图识别或跨课程最优教学决策。</w:t>
+      </w:r>
+    </w:p>
+    <w:p>
+      <w:pPr>
+        <w:ind w:firstLine="440"/>
+      </w:pPr>
+      <w:r>
+        <w:rPr>
+          <w:rFonts w:ascii="Times New Roman" w:hAnsi="Times New Roman" w:eastAsia="Songti SC"/>
+          <w:color w:val="000000"/>
+        </w:rPr>
+        <w:t>唯一完整失败揭示了各层状态的实际差异。作者脚本在9月8日完成独立变式复习，22日完成独立原题复习，满足当前间隔门并写入长期stable；9月29日再次答错后，工作台当前证据已变为none，Knowledge短期保持状态为needs_review，但长期mastery仍保留stable及先前成功证据ID。当前工作台确实降级，不能据此说整个系统仍显示掌握；同样，工作台降级也不能证明所有长期消费者已失效该标记。这是未限定长期状态与当前资格之间的一处不一致，不是观察到真实学生误判或在线模型误导。</w:t>
+      </w:r>
+    </w:p>
+    <w:p>
+      <w:pPr>
+        <w:ind w:firstLine="440"/>
+      </w:pPr>
+      <w:r>
+        <w:rPr>
+          <w:rFonts w:ascii="Times New Roman" w:hAnsi="Times New Roman" w:eastAsia="Songti SC"/>
+          <w:color w:val="000000"/>
+        </w:rPr>
+        <w:t>首次交互运行完整保留。其验证器误要求所有复习Attempt的最终role均为review，未考虑正式纠错会将失败或不会的来源Attempt改为original并通过RemediationCase关联。独立审计确认该合法后继转换后，只增加严格的纠错来源闭包校验和负例测试，十四个案例及80项主断言保持不变，重新冻结并运行。第一轮12/14不作为正式通过率；长期stable未失效在两轮原始记录中均存在，修订没有消除该失败。完整原始返回与失败源码随补充材料提供。</w:t>
+      </w:r>
+    </w:p>
+    <w:p>
+      <w:pPr>
+        <w:pStyle w:val="Heading2"/>
+      </w:pPr>
+      <w:r>
+        <w:rPr>
+          <w:rFonts w:ascii="Times New Roman" w:hAnsi="Times New Roman" w:eastAsia="Songti SC"/>
+          <w:color w:val="000000"/>
+        </w:rPr>
+        <w:t>5.7 长尾来源交付与非单调的读取增益</w:t>
+      </w:r>
+    </w:p>
+    <w:p>
+      <w:pPr>
+        <w:ind w:firstLine="440"/>
+      </w:pPr>
+      <w:r>
+        <w:rPr>
+          <w:rFonts w:ascii="Times New Roman" w:hAnsi="Times New Roman" w:eastAsia="Songti SC"/>
+          <w:color w:val="000000"/>
+        </w:rPr>
+        <w:t>正式第三轮完成228/228次实际读取和36份形成快照，源码漂移、网络与模型调用均为0。保存的形成记录、上下文包及评分重开后复算一致，来源、作用域和预算检查全部通过。这表示该次测量完整有效，不表示全部检索问题正确。共同配置的分层结果见表7，每格有10个目标查询和3个负向查询；同主题最初与当前共享历史，不是独立学生。</w:t>
+      </w:r>
+    </w:p>
+    <w:p>
+      <w:pPr>
+        <w:pStyle w:val="Caption"/>
+        <w:keepNext/>
+      </w:pPr>
+      <w:r>
+        <w:rPr>
+          <w:rFonts w:ascii="Times New Roman" w:hAnsi="Times New Roman" w:eastAsia="Songti SC"/>
+          <w:color w:val="000000"/>
+        </w:rPr>
+        <w:t>表7 长历史下的同条事实交付与负向查询</w:t>
+      </w:r>
+    </w:p>
+    <w:tbl>
+      <w:tblPr>
+        <w:tblW w:type="auto" w:w="0"/>
+        <w:jc w:val="center"/>
+        <w:tblLayout w:type="fixed"/>
+        <w:tblLook w:firstColumn="1" w:firstRow="1" w:lastColumn="0" w:lastRow="0" w:noHBand="0" w:noVBand="1" w:val="04A0"/>
+      </w:tblPr>
+      <w:tblGrid>
+        <w:gridCol w:w="765"/>
+        <w:gridCol w:w="1956"/>
+        <w:gridCol w:w="1644"/>
+        <w:gridCol w:w="1644"/>
+        <w:gridCol w:w="1757"/>
+        <w:gridCol w:w="1979"/>
+      </w:tblGrid>
+      <w:tr>
+        <w:trPr>
+          <w:cantSplit/>
+          <w:tblHeader/>
+        </w:trPr>
+        <w:tc>
+          <w:tcPr>
+            <w:tcW w:type="dxa" w:w="765"/>
+            <w:vAlign w:val="center"/>
+            <w:tcMar>
+              <w:top w:w="75" w:type="dxa"/>
+              <w:bottom w:w="75" w:type="dxa"/>
+              <w:left w:w="75" w:type="dxa"/>
+              <w:right w:w="75" w:type="dxa"/>
+            </w:tcMar>
+            <w:tcBorders>
+              <w:top w:val="single" w:sz="4" w:color="D9D9D9"/>
+              <w:left w:val="single" w:sz="4" w:color="D9D9D9"/>
+              <w:bottom w:val="single" w:sz="4" w:color="D9D9D9"/>
+              <w:right w:val="single" w:sz="4" w:color="D9D9D9"/>
+            </w:tcBorders>
+            <w:shd w:fill="F1F2F3"/>
+          </w:tcPr>
+          <w:p>
+            <w:pPr>
+              <w:spacing w:after="0" w:before="0" w:line="264" w:lineRule="auto"/>
+              <w:ind w:firstLine="0"/>
+              <w:jc w:val="center"/>
+            </w:pPr>
+            <w:r>
+              <w:rPr>
+                <w:rFonts w:ascii="Times New Roman" w:hAnsi="Times New Roman" w:eastAsia="Songti SC"/>
+                <w:b/>
+                <w:color w:val="000000"/>
+                <w:sz w:val="19"/>
+              </w:rPr>
+              <w:t>后续干扰</w:t>
+            </w:r>
+          </w:p>
+        </w:tc>
+        <w:tc>
+          <w:tcPr>
+            <w:tcW w:type="dxa" w:w="1956"/>
+            <w:vAlign w:val="center"/>
+            <w:tcMar>
+              <w:top w:w="75" w:type="dxa"/>
+              <w:bottom w:w="75" w:type="dxa"/>
+              <w:left w:w="75" w:type="dxa"/>
+              <w:right w:w="75" w:type="dxa"/>
+            </w:tcMar>
+            <w:tcBorders>
+              <w:top w:val="single" w:sz="4" w:color="D9D9D9"/>
+              <w:left w:val="single" w:sz="4" w:color="D9D9D9"/>
+              <w:bottom w:val="single" w:sz="4" w:color="D9D9D9"/>
+              <w:right w:val="single" w:sz="4" w:color="D9D9D9"/>
+            </w:tcBorders>
+            <w:shd w:fill="F1F2F3"/>
+          </w:tcPr>
+          <w:p>
+            <w:pPr>
+              <w:spacing w:after="0" w:before="0" w:line="264" w:lineRule="auto"/>
+              <w:ind w:firstLine="0"/>
+              <w:jc w:val="left"/>
+            </w:pPr>
+            <w:r>
+              <w:rPr>
+                <w:rFonts w:ascii="Times New Roman" w:hAnsi="Times New Roman" w:eastAsia="Songti SC"/>
+                <w:b/>
+                <w:color w:val="000000"/>
+                <w:sz w:val="19"/>
+              </w:rPr>
+              <w:t>预算</w:t>
+            </w:r>
+          </w:p>
+        </w:tc>
+        <w:tc>
+          <w:tcPr>
+            <w:tcW w:type="dxa" w:w="1644"/>
+            <w:vAlign w:val="center"/>
+            <w:tcMar>
+              <w:top w:w="75" w:type="dxa"/>
+              <w:bottom w:w="75" w:type="dxa"/>
+              <w:left w:w="75" w:type="dxa"/>
+              <w:right w:w="75" w:type="dxa"/>
+            </w:tcMar>
+            <w:tcBorders>
+              <w:top w:val="single" w:sz="4" w:color="D9D9D9"/>
+              <w:left w:val="single" w:sz="4" w:color="D9D9D9"/>
+              <w:bottom w:val="single" w:sz="4" w:color="D9D9D9"/>
+              <w:right w:val="single" w:sz="4" w:color="D9D9D9"/>
+            </w:tcBorders>
+            <w:shd w:fill="F1F2F3"/>
+          </w:tcPr>
+          <w:p>
+            <w:pPr>
+              <w:spacing w:after="0" w:before="0" w:line="264" w:lineRule="auto"/>
+              <w:ind w:firstLine="0"/>
+              <w:jc w:val="center"/>
+            </w:pPr>
+            <w:r>
+              <w:rPr>
+                <w:rFonts w:ascii="Times New Roman" w:hAnsi="Times New Roman" w:eastAsia="Songti SC"/>
+                <w:b/>
+                <w:color w:val="000000"/>
+                <w:sz w:val="19"/>
+              </w:rPr>
+              <w:t>默认目标与限定</w:t>
+            </w:r>
+          </w:p>
+        </w:tc>
+        <w:tc>
+          <w:tcPr>
+            <w:tcW w:type="dxa" w:w="1644"/>
+            <w:vAlign w:val="center"/>
+            <w:tcMar>
+              <w:top w:w="75" w:type="dxa"/>
+              <w:bottom w:w="75" w:type="dxa"/>
+              <w:left w:w="75" w:type="dxa"/>
+              <w:right w:w="75" w:type="dxa"/>
+            </w:tcMar>
+            <w:tcBorders>
+              <w:top w:val="single" w:sz="4" w:color="D9D9D9"/>
+              <w:left w:val="single" w:sz="4" w:color="D9D9D9"/>
+              <w:bottom w:val="single" w:sz="4" w:color="D9D9D9"/>
+              <w:right w:val="single" w:sz="4" w:color="D9D9D9"/>
+            </w:tcBorders>
+            <w:shd w:fill="F1F2F3"/>
+          </w:tcPr>
+          <w:p>
+            <w:pPr>
+              <w:spacing w:after="0" w:before="0" w:line="264" w:lineRule="auto"/>
+              <w:ind w:firstLine="0"/>
+              <w:jc w:val="center"/>
+            </w:pPr>
+            <w:r>
+              <w:rPr>
+                <w:rFonts w:ascii="Times New Roman" w:hAnsi="Times New Roman" w:eastAsia="Songti SC"/>
+                <w:b/>
+                <w:color w:val="000000"/>
+                <w:sz w:val="19"/>
+              </w:rPr>
+              <w:t>原文配置目标与限定</w:t>
+            </w:r>
+          </w:p>
+        </w:tc>
+        <w:tc>
+          <w:tcPr>
+            <w:tcW w:type="dxa" w:w="1757"/>
+            <w:vAlign w:val="center"/>
+            <w:tcMar>
+              <w:top w:w="75" w:type="dxa"/>
+              <w:bottom w:w="75" w:type="dxa"/>
+              <w:left w:w="75" w:type="dxa"/>
+              <w:right w:w="75" w:type="dxa"/>
+            </w:tcMar>
+            <w:tcBorders>
+              <w:top w:val="single" w:sz="4" w:color="D9D9D9"/>
+              <w:left w:val="single" w:sz="4" w:color="D9D9D9"/>
+              <w:bottom w:val="single" w:sz="4" w:color="D9D9D9"/>
+              <w:right w:val="single" w:sz="4" w:color="D9D9D9"/>
+            </w:tcBorders>
+            <w:shd w:fill="F1F2F3"/>
+          </w:tcPr>
+          <w:p>
+            <w:pPr>
+              <w:spacing w:after="0" w:before="0" w:line="264" w:lineRule="auto"/>
+              <w:ind w:firstLine="0"/>
+              <w:jc w:val="center"/>
+            </w:pPr>
+            <w:r>
+              <w:rPr>
+                <w:rFonts w:ascii="Times New Roman" w:hAnsi="Times New Roman" w:eastAsia="Songti SC"/>
+                <w:b/>
+                <w:color w:val="000000"/>
+                <w:sz w:val="19"/>
+              </w:rPr>
+              <w:t>默认负向严格空</w:t>
+            </w:r>
+          </w:p>
+        </w:tc>
+        <w:tc>
+          <w:tcPr>
+            <w:tcW w:type="dxa" w:w="1979"/>
+            <w:vAlign w:val="center"/>
+            <w:tcMar>
+              <w:top w:w="75" w:type="dxa"/>
+              <w:bottom w:w="75" w:type="dxa"/>
+              <w:left w:w="75" w:type="dxa"/>
+              <w:right w:w="75" w:type="dxa"/>
+            </w:tcMar>
+            <w:tcBorders>
+              <w:top w:val="single" w:sz="4" w:color="D9D9D9"/>
+              <w:left w:val="single" w:sz="4" w:color="D9D9D9"/>
+              <w:bottom w:val="single" w:sz="4" w:color="D9D9D9"/>
+              <w:right w:val="single" w:sz="4" w:color="D9D9D9"/>
+            </w:tcBorders>
+            <w:shd w:fill="F1F2F3"/>
+          </w:tcPr>
+          <w:p>
+            <w:pPr>
+              <w:spacing w:after="0" w:before="0" w:line="264" w:lineRule="auto"/>
+              <w:ind w:firstLine="0"/>
+              <w:jc w:val="center"/>
+            </w:pPr>
+            <w:r>
+              <w:rPr>
+                <w:rFonts w:ascii="Times New Roman" w:hAnsi="Times New Roman" w:eastAsia="Songti SC"/>
+                <w:b/>
+                <w:color w:val="000000"/>
+                <w:sz w:val="19"/>
+              </w:rPr>
+              <w:t>原文配置负向严格空</w:t>
+            </w:r>
+          </w:p>
+        </w:tc>
+      </w:tr>
+      <w:tr>
+        <w:trPr>
+          <w:cantSplit/>
+        </w:trPr>
+        <w:tc>
+          <w:tcPr>
+            <w:tcW w:type="dxa" w:w="765"/>
+            <w:vAlign w:val="center"/>
+            <w:tcMar>
+              <w:top w:w="75" w:type="dxa"/>
+              <w:bottom w:w="75" w:type="dxa"/>
+              <w:left w:w="75" w:type="dxa"/>
+              <w:right w:w="75" w:type="dxa"/>
+            </w:tcMar>
+            <w:tcBorders>
+              <w:top w:val="single" w:sz="4" w:color="D9D9D9"/>
+              <w:left w:val="single" w:sz="4" w:color="D9D9D9"/>
+              <w:bottom w:val="single" w:sz="4" w:color="D9D9D9"/>
+              <w:right w:val="single" w:sz="4" w:color="D9D9D9"/>
+            </w:tcBorders>
+          </w:tcPr>
+          <w:p>
+            <w:pPr>
+              <w:spacing w:after="0" w:before="0" w:line="264" w:lineRule="auto"/>
+              <w:ind w:firstLine="0"/>
+              <w:jc w:val="center"/>
+            </w:pPr>
+            <w:r>
+              <w:rPr>
+                <w:rFonts w:ascii="Times New Roman" w:hAnsi="Times New Roman" w:eastAsia="Songti SC"/>
+                <w:b w:val="0"/>
+                <w:color w:val="000000"/>
+                <w:sz w:val="19"/>
+              </w:rPr>
+              <w:t>4</w:t>
+            </w:r>
+          </w:p>
+        </w:tc>
+        <w:tc>
+          <w:tcPr>
+            <w:tcW w:type="dxa" w:w="1956"/>
+            <w:vAlign w:val="center"/>
+            <w:tcMar>
+              <w:top w:w="75" w:type="dxa"/>
+              <w:bottom w:w="75" w:type="dxa"/>
+              <w:left w:w="75" w:type="dxa"/>
+              <w:right w:w="75" w:type="dxa"/>
+            </w:tcMar>
+            <w:tcBorders>
+              <w:top w:val="single" w:sz="4" w:color="D9D9D9"/>
+              <w:left w:val="single" w:sz="4" w:color="D9D9D9"/>
+              <w:bottom w:val="single" w:sz="4" w:color="D9D9D9"/>
+              <w:right w:val="single" w:sz="4" w:color="D9D9D9"/>
+            </w:tcBorders>
+          </w:tcPr>
+          <w:p>
+            <w:pPr>
+              <w:spacing w:after="0" w:before="0" w:line="264" w:lineRule="auto"/>
+              <w:ind w:firstLine="0"/>
+              <w:jc w:val="left"/>
+            </w:pPr>
+            <w:r>
+              <w:rPr>
+                <w:rFonts w:ascii="Times New Roman" w:hAnsi="Times New Roman" w:eastAsia="Songti SC"/>
+                <w:b w:val="0"/>
+                <w:color w:val="000000"/>
+                <w:sz w:val="19"/>
+              </w:rPr>
+              <w:t>1,800</w:t>
+            </w:r>
+          </w:p>
+        </w:tc>
+        <w:tc>
+          <w:tcPr>
+            <w:tcW w:type="dxa" w:w="1644"/>
+            <w:vAlign w:val="center"/>
+            <w:tcMar>
+              <w:top w:w="75" w:type="dxa"/>
+              <w:bottom w:w="75" w:type="dxa"/>
+              <w:left w:w="75" w:type="dxa"/>
+              <w:right w:w="75" w:type="dxa"/>
+            </w:tcMar>
+            <w:tcBorders>
+              <w:top w:val="single" w:sz="4" w:color="D9D9D9"/>
+              <w:left w:val="single" w:sz="4" w:color="D9D9D9"/>
+              <w:bottom w:val="single" w:sz="4" w:color="D9D9D9"/>
+              <w:right w:val="single" w:sz="4" w:color="D9D9D9"/>
+            </w:tcBorders>
+          </w:tcPr>
+          <w:p>
+            <w:pPr>
+              <w:spacing w:after="0" w:before="0" w:line="264" w:lineRule="auto"/>
+              <w:ind w:firstLine="0"/>
+              <w:jc w:val="center"/>
+            </w:pPr>
+            <w:r>
+              <w:rPr>
+                <w:rFonts w:ascii="Times New Roman" w:hAnsi="Times New Roman" w:eastAsia="Songti SC"/>
+                <w:b w:val="0"/>
+                <w:color w:val="000000"/>
+                <w:sz w:val="19"/>
+              </w:rPr>
+              <w:t>7/10</w:t>
+            </w:r>
+          </w:p>
+        </w:tc>
+        <w:tc>
+          <w:tcPr>
+            <w:tcW w:type="dxa" w:w="1644"/>
+            <w:vAlign w:val="center"/>
+            <w:tcMar>
+              <w:top w:w="75" w:type="dxa"/>
+              <w:bottom w:w="75" w:type="dxa"/>
+              <w:left w:w="75" w:type="dxa"/>
+              <w:right w:w="75" w:type="dxa"/>
+            </w:tcMar>
+            <w:tcBorders>
+              <w:top w:val="single" w:sz="4" w:color="D9D9D9"/>
+              <w:left w:val="single" w:sz="4" w:color="D9D9D9"/>
+              <w:bottom w:val="single" w:sz="4" w:color="D9D9D9"/>
+              <w:right w:val="single" w:sz="4" w:color="D9D9D9"/>
+            </w:tcBorders>
+          </w:tcPr>
+          <w:p>
+            <w:pPr>
+              <w:spacing w:after="0" w:before="0" w:line="264" w:lineRule="auto"/>
+              <w:ind w:firstLine="0"/>
+              <w:jc w:val="center"/>
+            </w:pPr>
+            <w:r>
+              <w:rPr>
+                <w:rFonts w:ascii="Times New Roman" w:hAnsi="Times New Roman" w:eastAsia="Songti SC"/>
+                <w:b w:val="0"/>
+                <w:color w:val="000000"/>
+                <w:sz w:val="19"/>
+              </w:rPr>
+              <w:t>9/10</w:t>
+            </w:r>
+          </w:p>
+        </w:tc>
+        <w:tc>
+          <w:tcPr>
+            <w:tcW w:type="dxa" w:w="1757"/>
+            <w:vAlign w:val="center"/>
+            <w:tcMar>
+              <w:top w:w="75" w:type="dxa"/>
+              <w:bottom w:w="75" w:type="dxa"/>
+              <w:left w:w="75" w:type="dxa"/>
+              <w:right w:w="75" w:type="dxa"/>
+            </w:tcMar>
+            <w:tcBorders>
+              <w:top w:val="single" w:sz="4" w:color="D9D9D9"/>
+              <w:left w:val="single" w:sz="4" w:color="D9D9D9"/>
+              <w:bottom w:val="single" w:sz="4" w:color="D9D9D9"/>
+              <w:right w:val="single" w:sz="4" w:color="D9D9D9"/>
+            </w:tcBorders>
+          </w:tcPr>
+          <w:p>
+            <w:pPr>
+              <w:spacing w:after="0" w:before="0" w:line="264" w:lineRule="auto"/>
+              <w:ind w:firstLine="0"/>
+              <w:jc w:val="center"/>
+            </w:pPr>
+            <w:r>
+              <w:rPr>
+                <w:rFonts w:ascii="Times New Roman" w:hAnsi="Times New Roman" w:eastAsia="Songti SC"/>
+                <w:b w:val="0"/>
+                <w:color w:val="000000"/>
+                <w:sz w:val="19"/>
+              </w:rPr>
+              <w:t>3/3</w:t>
+            </w:r>
+          </w:p>
+        </w:tc>
+        <w:tc>
+          <w:tcPr>
+            <w:tcW w:type="dxa" w:w="1979"/>
+            <w:vAlign w:val="center"/>
+            <w:tcMar>
+              <w:top w:w="75" w:type="dxa"/>
+              <w:bottom w:w="75" w:type="dxa"/>
+              <w:left w:w="75" w:type="dxa"/>
+              <w:right w:w="75" w:type="dxa"/>
+            </w:tcMar>
+            <w:tcBorders>
+              <w:top w:val="single" w:sz="4" w:color="D9D9D9"/>
+              <w:left w:val="single" w:sz="4" w:color="D9D9D9"/>
+              <w:bottom w:val="single" w:sz="4" w:color="D9D9D9"/>
+              <w:right w:val="single" w:sz="4" w:color="D9D9D9"/>
+            </w:tcBorders>
+          </w:tcPr>
+          <w:p>
+            <w:pPr>
+              <w:spacing w:after="0" w:before="0" w:line="264" w:lineRule="auto"/>
+              <w:ind w:firstLine="0"/>
+              <w:jc w:val="center"/>
+            </w:pPr>
+            <w:r>
+              <w:rPr>
+                <w:rFonts w:ascii="Times New Roman" w:hAnsi="Times New Roman" w:eastAsia="Songti SC"/>
+                <w:b w:val="0"/>
+                <w:color w:val="000000"/>
+                <w:sz w:val="19"/>
+              </w:rPr>
+              <w:t>3/3</w:t>
+            </w:r>
+          </w:p>
+        </w:tc>
+      </w:tr>
+      <w:tr>
+        <w:trPr>
+          <w:cantSplit/>
+        </w:trPr>
+        <w:tc>
+          <w:tcPr>
+            <w:tcW w:type="dxa" w:w="765"/>
+            <w:vAlign w:val="center"/>
+            <w:tcMar>
+              <w:top w:w="75" w:type="dxa"/>
+              <w:bottom w:w="75" w:type="dxa"/>
+              <w:left w:w="75" w:type="dxa"/>
+              <w:right w:w="75" w:type="dxa"/>
+            </w:tcMar>
+            <w:tcBorders>
+              <w:top w:val="single" w:sz="4" w:color="D9D9D9"/>
+              <w:left w:val="single" w:sz="4" w:color="D9D9D9"/>
+              <w:bottom w:val="single" w:sz="4" w:color="D9D9D9"/>
+              <w:right w:val="single" w:sz="4" w:color="D9D9D9"/>
+            </w:tcBorders>
+          </w:tcPr>
+          <w:p>
+            <w:pPr>
+              <w:spacing w:after="0" w:before="0" w:line="264" w:lineRule="auto"/>
+              <w:ind w:firstLine="0"/>
+              <w:jc w:val="center"/>
+            </w:pPr>
+            <w:r>
+              <w:rPr>
+                <w:rFonts w:ascii="Times New Roman" w:hAnsi="Times New Roman" w:eastAsia="Songti SC"/>
+                <w:b w:val="0"/>
+                <w:color w:val="000000"/>
+                <w:sz w:val="19"/>
+              </w:rPr>
+              <w:t>4</w:t>
+            </w:r>
+          </w:p>
+        </w:tc>
+        <w:tc>
+          <w:tcPr>
+            <w:tcW w:type="dxa" w:w="1956"/>
+            <w:vAlign w:val="center"/>
+            <w:tcMar>
+              <w:top w:w="75" w:type="dxa"/>
+              <w:bottom w:w="75" w:type="dxa"/>
+              <w:left w:w="75" w:type="dxa"/>
+              <w:right w:w="75" w:type="dxa"/>
+            </w:tcMar>
+            <w:tcBorders>
+              <w:top w:val="single" w:sz="4" w:color="D9D9D9"/>
+              <w:left w:val="single" w:sz="4" w:color="D9D9D9"/>
+              <w:bottom w:val="single" w:sz="4" w:color="D9D9D9"/>
+              <w:right w:val="single" w:sz="4" w:color="D9D9D9"/>
+            </w:tcBorders>
+          </w:tcPr>
+          <w:p>
+            <w:pPr>
+              <w:spacing w:after="0" w:before="0" w:line="264" w:lineRule="auto"/>
+              <w:ind w:firstLine="0"/>
+              <w:jc w:val="left"/>
+            </w:pPr>
+            <w:r>
+              <w:rPr>
+                <w:rFonts w:ascii="Times New Roman" w:hAnsi="Times New Roman" w:eastAsia="Songti SC"/>
+                <w:b w:val="0"/>
+                <w:color w:val="000000"/>
+                <w:sz w:val="19"/>
+              </w:rPr>
+              <w:t>3,200</w:t>
+            </w:r>
+          </w:p>
+        </w:tc>
+        <w:tc>
+          <w:tcPr>
+            <w:tcW w:type="dxa" w:w="1644"/>
+            <w:vAlign w:val="center"/>
+            <w:tcMar>
+              <w:top w:w="75" w:type="dxa"/>
+              <w:bottom w:w="75" w:type="dxa"/>
+              <w:left w:w="75" w:type="dxa"/>
+              <w:right w:w="75" w:type="dxa"/>
+            </w:tcMar>
+            <w:tcBorders>
+              <w:top w:val="single" w:sz="4" w:color="D9D9D9"/>
+              <w:left w:val="single" w:sz="4" w:color="D9D9D9"/>
+              <w:bottom w:val="single" w:sz="4" w:color="D9D9D9"/>
+              <w:right w:val="single" w:sz="4" w:color="D9D9D9"/>
+            </w:tcBorders>
+          </w:tcPr>
+          <w:p>
+            <w:pPr>
+              <w:spacing w:after="0" w:before="0" w:line="264" w:lineRule="auto"/>
+              <w:ind w:firstLine="0"/>
+              <w:jc w:val="center"/>
+            </w:pPr>
+            <w:r>
+              <w:rPr>
+                <w:rFonts w:ascii="Times New Roman" w:hAnsi="Times New Roman" w:eastAsia="Songti SC"/>
+                <w:b w:val="0"/>
+                <w:color w:val="000000"/>
+                <w:sz w:val="19"/>
+              </w:rPr>
+              <w:t>7/10</w:t>
+            </w:r>
+          </w:p>
+        </w:tc>
+        <w:tc>
+          <w:tcPr>
+            <w:tcW w:type="dxa" w:w="1644"/>
+            <w:vAlign w:val="center"/>
+            <w:tcMar>
+              <w:top w:w="75" w:type="dxa"/>
+              <w:bottom w:w="75" w:type="dxa"/>
+              <w:left w:w="75" w:type="dxa"/>
+              <w:right w:w="75" w:type="dxa"/>
+            </w:tcMar>
+            <w:tcBorders>
+              <w:top w:val="single" w:sz="4" w:color="D9D9D9"/>
+              <w:left w:val="single" w:sz="4" w:color="D9D9D9"/>
+              <w:bottom w:val="single" w:sz="4" w:color="D9D9D9"/>
+              <w:right w:val="single" w:sz="4" w:color="D9D9D9"/>
+            </w:tcBorders>
+          </w:tcPr>
+          <w:p>
+            <w:pPr>
+              <w:spacing w:after="0" w:before="0" w:line="264" w:lineRule="auto"/>
+              <w:ind w:firstLine="0"/>
+              <w:jc w:val="center"/>
+            </w:pPr>
+            <w:r>
+              <w:rPr>
+                <w:rFonts w:ascii="Times New Roman" w:hAnsi="Times New Roman" w:eastAsia="Songti SC"/>
+                <w:b w:val="0"/>
+                <w:color w:val="000000"/>
+                <w:sz w:val="19"/>
+              </w:rPr>
+              <w:t>9/10</w:t>
+            </w:r>
+          </w:p>
+        </w:tc>
+        <w:tc>
+          <w:tcPr>
+            <w:tcW w:type="dxa" w:w="1757"/>
+            <w:vAlign w:val="center"/>
+            <w:tcMar>
+              <w:top w:w="75" w:type="dxa"/>
+              <w:bottom w:w="75" w:type="dxa"/>
+              <w:left w:w="75" w:type="dxa"/>
+              <w:right w:w="75" w:type="dxa"/>
+            </w:tcMar>
+            <w:tcBorders>
+              <w:top w:val="single" w:sz="4" w:color="D9D9D9"/>
+              <w:left w:val="single" w:sz="4" w:color="D9D9D9"/>
+              <w:bottom w:val="single" w:sz="4" w:color="D9D9D9"/>
+              <w:right w:val="single" w:sz="4" w:color="D9D9D9"/>
+            </w:tcBorders>
+          </w:tcPr>
+          <w:p>
+            <w:pPr>
+              <w:spacing w:after="0" w:before="0" w:line="264" w:lineRule="auto"/>
+              <w:ind w:firstLine="0"/>
+              <w:jc w:val="center"/>
+            </w:pPr>
+            <w:r>
+              <w:rPr>
+                <w:rFonts w:ascii="Times New Roman" w:hAnsi="Times New Roman" w:eastAsia="Songti SC"/>
+                <w:b w:val="0"/>
+                <w:color w:val="000000"/>
+                <w:sz w:val="19"/>
+              </w:rPr>
+              <w:t>3/3</w:t>
+            </w:r>
+          </w:p>
+        </w:tc>
+        <w:tc>
+          <w:tcPr>
+            <w:tcW w:type="dxa" w:w="1979"/>
+            <w:vAlign w:val="center"/>
+            <w:tcMar>
+              <w:top w:w="75" w:type="dxa"/>
+              <w:bottom w:w="75" w:type="dxa"/>
+              <w:left w:w="75" w:type="dxa"/>
+              <w:right w:w="75" w:type="dxa"/>
+            </w:tcMar>
+            <w:tcBorders>
+              <w:top w:val="single" w:sz="4" w:color="D9D9D9"/>
+              <w:left w:val="single" w:sz="4" w:color="D9D9D9"/>
+              <w:bottom w:val="single" w:sz="4" w:color="D9D9D9"/>
+              <w:right w:val="single" w:sz="4" w:color="D9D9D9"/>
+            </w:tcBorders>
+          </w:tcPr>
+          <w:p>
+            <w:pPr>
+              <w:spacing w:after="0" w:before="0" w:line="264" w:lineRule="auto"/>
+              <w:ind w:firstLine="0"/>
+              <w:jc w:val="center"/>
+            </w:pPr>
+            <w:r>
+              <w:rPr>
+                <w:rFonts w:ascii="Times New Roman" w:hAnsi="Times New Roman" w:eastAsia="Songti SC"/>
+                <w:b w:val="0"/>
+                <w:color w:val="000000"/>
+                <w:sz w:val="19"/>
+              </w:rPr>
+              <w:t>3/3</w:t>
+            </w:r>
+          </w:p>
+        </w:tc>
+      </w:tr>
+      <w:tr>
+        <w:trPr>
+          <w:cantSplit/>
+        </w:trPr>
+        <w:tc>
+          <w:tcPr>
+            <w:tcW w:type="dxa" w:w="765"/>
+            <w:vAlign w:val="center"/>
+            <w:tcMar>
+              <w:top w:w="75" w:type="dxa"/>
+              <w:bottom w:w="75" w:type="dxa"/>
+              <w:left w:w="75" w:type="dxa"/>
+              <w:right w:w="75" w:type="dxa"/>
+            </w:tcMar>
+            <w:tcBorders>
+              <w:top w:val="single" w:sz="4" w:color="D9D9D9"/>
+              <w:left w:val="single" w:sz="4" w:color="D9D9D9"/>
+              <w:bottom w:val="single" w:sz="4" w:color="D9D9D9"/>
+              <w:right w:val="single" w:sz="4" w:color="D9D9D9"/>
+            </w:tcBorders>
+          </w:tcPr>
+          <w:p>
+            <w:pPr>
+              <w:spacing w:after="0" w:before="0" w:line="264" w:lineRule="auto"/>
+              <w:ind w:firstLine="0"/>
+              <w:jc w:val="center"/>
+            </w:pPr>
+            <w:r>
+              <w:rPr>
+                <w:rFonts w:ascii="Times New Roman" w:hAnsi="Times New Roman" w:eastAsia="Songti SC"/>
+                <w:b w:val="0"/>
+                <w:color w:val="000000"/>
+                <w:sz w:val="19"/>
+              </w:rPr>
+              <w:t>64</w:t>
+            </w:r>
+          </w:p>
+        </w:tc>
+        <w:tc>
+          <w:tcPr>
+            <w:tcW w:type="dxa" w:w="1956"/>
+            <w:vAlign w:val="center"/>
+            <w:tcMar>
+              <w:top w:w="75" w:type="dxa"/>
+              <w:bottom w:w="75" w:type="dxa"/>
+              <w:left w:w="75" w:type="dxa"/>
+              <w:right w:w="75" w:type="dxa"/>
+            </w:tcMar>
+            <w:tcBorders>
+              <w:top w:val="single" w:sz="4" w:color="D9D9D9"/>
+              <w:left w:val="single" w:sz="4" w:color="D9D9D9"/>
+              <w:bottom w:val="single" w:sz="4" w:color="D9D9D9"/>
+              <w:right w:val="single" w:sz="4" w:color="D9D9D9"/>
+            </w:tcBorders>
+          </w:tcPr>
+          <w:p>
+            <w:pPr>
+              <w:spacing w:after="0" w:before="0" w:line="264" w:lineRule="auto"/>
+              <w:ind w:firstLine="0"/>
+              <w:jc w:val="left"/>
+            </w:pPr>
+            <w:r>
+              <w:rPr>
+                <w:rFonts w:ascii="Times New Roman" w:hAnsi="Times New Roman" w:eastAsia="Songti SC"/>
+                <w:b w:val="0"/>
+                <w:color w:val="000000"/>
+                <w:sz w:val="19"/>
+              </w:rPr>
+              <w:t>1,800</w:t>
+            </w:r>
+          </w:p>
+        </w:tc>
+        <w:tc>
+          <w:tcPr>
+            <w:tcW w:type="dxa" w:w="1644"/>
+            <w:vAlign w:val="center"/>
+            <w:tcMar>
+              <w:top w:w="75" w:type="dxa"/>
+              <w:bottom w:w="75" w:type="dxa"/>
+              <w:left w:w="75" w:type="dxa"/>
+              <w:right w:w="75" w:type="dxa"/>
+            </w:tcMar>
+            <w:tcBorders>
+              <w:top w:val="single" w:sz="4" w:color="D9D9D9"/>
+              <w:left w:val="single" w:sz="4" w:color="D9D9D9"/>
+              <w:bottom w:val="single" w:sz="4" w:color="D9D9D9"/>
+              <w:right w:val="single" w:sz="4" w:color="D9D9D9"/>
+            </w:tcBorders>
+          </w:tcPr>
+          <w:p>
+            <w:pPr>
+              <w:spacing w:after="0" w:before="0" w:line="264" w:lineRule="auto"/>
+              <w:ind w:firstLine="0"/>
+              <w:jc w:val="center"/>
+            </w:pPr>
+            <w:r>
+              <w:rPr>
+                <w:rFonts w:ascii="Times New Roman" w:hAnsi="Times New Roman" w:eastAsia="Songti SC"/>
+                <w:b w:val="0"/>
+                <w:color w:val="000000"/>
+                <w:sz w:val="19"/>
+              </w:rPr>
+              <w:t>6/10</w:t>
+            </w:r>
+          </w:p>
+        </w:tc>
+        <w:tc>
+          <w:tcPr>
+            <w:tcW w:type="dxa" w:w="1644"/>
+            <w:vAlign w:val="center"/>
+            <w:tcMar>
+              <w:top w:w="75" w:type="dxa"/>
+              <w:bottom w:w="75" w:type="dxa"/>
+              <w:left w:w="75" w:type="dxa"/>
+              <w:right w:w="75" w:type="dxa"/>
+            </w:tcMar>
+            <w:tcBorders>
+              <w:top w:val="single" w:sz="4" w:color="D9D9D9"/>
+              <w:left w:val="single" w:sz="4" w:color="D9D9D9"/>
+              <w:bottom w:val="single" w:sz="4" w:color="D9D9D9"/>
+              <w:right w:val="single" w:sz="4" w:color="D9D9D9"/>
+            </w:tcBorders>
+          </w:tcPr>
+          <w:p>
+            <w:pPr>
+              <w:spacing w:after="0" w:before="0" w:line="264" w:lineRule="auto"/>
+              <w:ind w:firstLine="0"/>
+              <w:jc w:val="center"/>
+            </w:pPr>
+            <w:r>
+              <w:rPr>
+                <w:rFonts w:ascii="Times New Roman" w:hAnsi="Times New Roman" w:eastAsia="Songti SC"/>
+                <w:b w:val="0"/>
+                <w:color w:val="000000"/>
+                <w:sz w:val="19"/>
+              </w:rPr>
+              <w:t>8/10</w:t>
+            </w:r>
+          </w:p>
+        </w:tc>
+        <w:tc>
+          <w:tcPr>
+            <w:tcW w:type="dxa" w:w="1757"/>
+            <w:vAlign w:val="center"/>
+            <w:tcMar>
+              <w:top w:w="75" w:type="dxa"/>
+              <w:bottom w:w="75" w:type="dxa"/>
+              <w:left w:w="75" w:type="dxa"/>
+              <w:right w:w="75" w:type="dxa"/>
+            </w:tcMar>
+            <w:tcBorders>
+              <w:top w:val="single" w:sz="4" w:color="D9D9D9"/>
+              <w:left w:val="single" w:sz="4" w:color="D9D9D9"/>
+              <w:bottom w:val="single" w:sz="4" w:color="D9D9D9"/>
+              <w:right w:val="single" w:sz="4" w:color="D9D9D9"/>
+            </w:tcBorders>
+          </w:tcPr>
+          <w:p>
+            <w:pPr>
+              <w:spacing w:after="0" w:before="0" w:line="264" w:lineRule="auto"/>
+              <w:ind w:firstLine="0"/>
+              <w:jc w:val="center"/>
+            </w:pPr>
+            <w:r>
+              <w:rPr>
+                <w:rFonts w:ascii="Times New Roman" w:hAnsi="Times New Roman" w:eastAsia="Songti SC"/>
+                <w:b w:val="0"/>
+                <w:color w:val="000000"/>
+                <w:sz w:val="19"/>
+              </w:rPr>
+              <w:t>3/3</w:t>
+            </w:r>
+          </w:p>
+        </w:tc>
+        <w:tc>
+          <w:tcPr>
+            <w:tcW w:type="dxa" w:w="1979"/>
+            <w:vAlign w:val="center"/>
+            <w:tcMar>
+              <w:top w:w="75" w:type="dxa"/>
+              <w:bottom w:w="75" w:type="dxa"/>
+              <w:left w:w="75" w:type="dxa"/>
+              <w:right w:w="75" w:type="dxa"/>
+            </w:tcMar>
+            <w:tcBorders>
+              <w:top w:val="single" w:sz="4" w:color="D9D9D9"/>
+              <w:left w:val="single" w:sz="4" w:color="D9D9D9"/>
+              <w:bottom w:val="single" w:sz="4" w:color="D9D9D9"/>
+              <w:right w:val="single" w:sz="4" w:color="D9D9D9"/>
+            </w:tcBorders>
+          </w:tcPr>
+          <w:p>
+            <w:pPr>
+              <w:spacing w:after="0" w:before="0" w:line="264" w:lineRule="auto"/>
+              <w:ind w:firstLine="0"/>
+              <w:jc w:val="center"/>
+            </w:pPr>
+            <w:r>
+              <w:rPr>
+                <w:rFonts w:ascii="Times New Roman" w:hAnsi="Times New Roman" w:eastAsia="Songti SC"/>
+                <w:b w:val="0"/>
+                <w:color w:val="000000"/>
+                <w:sz w:val="19"/>
+              </w:rPr>
+              <w:t>3/3</w:t>
+            </w:r>
+          </w:p>
+        </w:tc>
+      </w:tr>
+      <w:tr>
+        <w:trPr>
+          <w:cantSplit/>
+        </w:trPr>
+        <w:tc>
+          <w:tcPr>
+            <w:tcW w:type="dxa" w:w="765"/>
+            <w:vAlign w:val="center"/>
+            <w:tcMar>
+              <w:top w:w="75" w:type="dxa"/>
+              <w:bottom w:w="75" w:type="dxa"/>
+              <w:left w:w="75" w:type="dxa"/>
+              <w:right w:w="75" w:type="dxa"/>
+            </w:tcMar>
+            <w:tcBorders>
+              <w:top w:val="single" w:sz="4" w:color="D9D9D9"/>
+              <w:left w:val="single" w:sz="4" w:color="D9D9D9"/>
+              <w:bottom w:val="single" w:sz="4" w:color="D9D9D9"/>
+              <w:right w:val="single" w:sz="4" w:color="D9D9D9"/>
+            </w:tcBorders>
+          </w:tcPr>
+          <w:p>
+            <w:pPr>
+              <w:spacing w:after="0" w:before="0" w:line="264" w:lineRule="auto"/>
+              <w:ind w:firstLine="0"/>
+              <w:jc w:val="center"/>
+            </w:pPr>
+            <w:r>
+              <w:rPr>
+                <w:rFonts w:ascii="Times New Roman" w:hAnsi="Times New Roman" w:eastAsia="Songti SC"/>
+                <w:b w:val="0"/>
+                <w:color w:val="000000"/>
+                <w:sz w:val="19"/>
+              </w:rPr>
+              <w:t>64</w:t>
+            </w:r>
+          </w:p>
+        </w:tc>
+        <w:tc>
+          <w:tcPr>
+            <w:tcW w:type="dxa" w:w="1956"/>
+            <w:vAlign w:val="center"/>
+            <w:tcMar>
+              <w:top w:w="75" w:type="dxa"/>
+              <w:bottom w:w="75" w:type="dxa"/>
+              <w:left w:w="75" w:type="dxa"/>
+              <w:right w:w="75" w:type="dxa"/>
+            </w:tcMar>
+            <w:tcBorders>
+              <w:top w:val="single" w:sz="4" w:color="D9D9D9"/>
+              <w:left w:val="single" w:sz="4" w:color="D9D9D9"/>
+              <w:bottom w:val="single" w:sz="4" w:color="D9D9D9"/>
+              <w:right w:val="single" w:sz="4" w:color="D9D9D9"/>
+            </w:tcBorders>
+          </w:tcPr>
+          <w:p>
+            <w:pPr>
+              <w:spacing w:after="0" w:before="0" w:line="264" w:lineRule="auto"/>
+              <w:ind w:firstLine="0"/>
+              <w:jc w:val="left"/>
+            </w:pPr>
+            <w:r>
+              <w:rPr>
+                <w:rFonts w:ascii="Times New Roman" w:hAnsi="Times New Roman" w:eastAsia="Songti SC"/>
+                <w:b w:val="0"/>
+                <w:color w:val="000000"/>
+                <w:sz w:val="19"/>
+              </w:rPr>
+              <w:t>3,200</w:t>
+            </w:r>
+          </w:p>
+        </w:tc>
+        <w:tc>
+          <w:tcPr>
+            <w:tcW w:type="dxa" w:w="1644"/>
+            <w:vAlign w:val="center"/>
+            <w:tcMar>
+              <w:top w:w="75" w:type="dxa"/>
+              <w:bottom w:w="75" w:type="dxa"/>
+              <w:left w:w="75" w:type="dxa"/>
+              <w:right w:w="75" w:type="dxa"/>
+            </w:tcMar>
+            <w:tcBorders>
+              <w:top w:val="single" w:sz="4" w:color="D9D9D9"/>
+              <w:left w:val="single" w:sz="4" w:color="D9D9D9"/>
+              <w:bottom w:val="single" w:sz="4" w:color="D9D9D9"/>
+              <w:right w:val="single" w:sz="4" w:color="D9D9D9"/>
+            </w:tcBorders>
+          </w:tcPr>
+          <w:p>
+            <w:pPr>
+              <w:spacing w:after="0" w:before="0" w:line="264" w:lineRule="auto"/>
+              <w:ind w:firstLine="0"/>
+              <w:jc w:val="center"/>
+            </w:pPr>
+            <w:r>
+              <w:rPr>
+                <w:rFonts w:ascii="Times New Roman" w:hAnsi="Times New Roman" w:eastAsia="Songti SC"/>
+                <w:b w:val="0"/>
+                <w:color w:val="000000"/>
+                <w:sz w:val="19"/>
+              </w:rPr>
+              <w:t>6/10</w:t>
+            </w:r>
+          </w:p>
+        </w:tc>
+        <w:tc>
+          <w:tcPr>
+            <w:tcW w:type="dxa" w:w="1644"/>
+            <w:vAlign w:val="center"/>
+            <w:tcMar>
+              <w:top w:w="75" w:type="dxa"/>
+              <w:bottom w:w="75" w:type="dxa"/>
+              <w:left w:w="75" w:type="dxa"/>
+              <w:right w:w="75" w:type="dxa"/>
+            </w:tcMar>
+            <w:tcBorders>
+              <w:top w:val="single" w:sz="4" w:color="D9D9D9"/>
+              <w:left w:val="single" w:sz="4" w:color="D9D9D9"/>
+              <w:bottom w:val="single" w:sz="4" w:color="D9D9D9"/>
+              <w:right w:val="single" w:sz="4" w:color="D9D9D9"/>
+            </w:tcBorders>
+          </w:tcPr>
+          <w:p>
+            <w:pPr>
+              <w:spacing w:after="0" w:before="0" w:line="264" w:lineRule="auto"/>
+              <w:ind w:firstLine="0"/>
+              <w:jc w:val="center"/>
+            </w:pPr>
+            <w:r>
+              <w:rPr>
+                <w:rFonts w:ascii="Times New Roman" w:hAnsi="Times New Roman" w:eastAsia="Songti SC"/>
+                <w:b w:val="0"/>
+                <w:color w:val="000000"/>
+                <w:sz w:val="19"/>
+              </w:rPr>
+              <w:t>8/10</w:t>
+            </w:r>
+          </w:p>
+        </w:tc>
+        <w:tc>
+          <w:tcPr>
+            <w:tcW w:type="dxa" w:w="1757"/>
+            <w:vAlign w:val="center"/>
+            <w:tcMar>
+              <w:top w:w="75" w:type="dxa"/>
+              <w:bottom w:w="75" w:type="dxa"/>
+              <w:left w:w="75" w:type="dxa"/>
+              <w:right w:w="75" w:type="dxa"/>
+            </w:tcMar>
+            <w:tcBorders>
+              <w:top w:val="single" w:sz="4" w:color="D9D9D9"/>
+              <w:left w:val="single" w:sz="4" w:color="D9D9D9"/>
+              <w:bottom w:val="single" w:sz="4" w:color="D9D9D9"/>
+              <w:right w:val="single" w:sz="4" w:color="D9D9D9"/>
+            </w:tcBorders>
+          </w:tcPr>
+          <w:p>
+            <w:pPr>
+              <w:spacing w:after="0" w:before="0" w:line="264" w:lineRule="auto"/>
+              <w:ind w:firstLine="0"/>
+              <w:jc w:val="center"/>
+            </w:pPr>
+            <w:r>
+              <w:rPr>
+                <w:rFonts w:ascii="Times New Roman" w:hAnsi="Times New Roman" w:eastAsia="Songti SC"/>
+                <w:b w:val="0"/>
+                <w:color w:val="000000"/>
+                <w:sz w:val="19"/>
+              </w:rPr>
+              <w:t>3/3</w:t>
+            </w:r>
+          </w:p>
+        </w:tc>
+        <w:tc>
+          <w:tcPr>
+            <w:tcW w:type="dxa" w:w="1979"/>
+            <w:vAlign w:val="center"/>
+            <w:tcMar>
+              <w:top w:w="75" w:type="dxa"/>
+              <w:bottom w:w="75" w:type="dxa"/>
+              <w:left w:w="75" w:type="dxa"/>
+              <w:right w:w="75" w:type="dxa"/>
+            </w:tcMar>
+            <w:tcBorders>
+              <w:top w:val="single" w:sz="4" w:color="D9D9D9"/>
+              <w:left w:val="single" w:sz="4" w:color="D9D9D9"/>
+              <w:bottom w:val="single" w:sz="4" w:color="D9D9D9"/>
+              <w:right w:val="single" w:sz="4" w:color="D9D9D9"/>
+            </w:tcBorders>
+          </w:tcPr>
+          <w:p>
+            <w:pPr>
+              <w:spacing w:after="0" w:before="0" w:line="264" w:lineRule="auto"/>
+              <w:ind w:firstLine="0"/>
+              <w:jc w:val="center"/>
+            </w:pPr>
+            <w:r>
+              <w:rPr>
+                <w:rFonts w:ascii="Times New Roman" w:hAnsi="Times New Roman" w:eastAsia="Songti SC"/>
+                <w:b w:val="0"/>
+                <w:color w:val="000000"/>
+                <w:sz w:val="19"/>
+              </w:rPr>
+              <w:t>3/3</w:t>
+            </w:r>
+          </w:p>
+        </w:tc>
+      </w:tr>
+      <w:tr>
+        <w:trPr>
+          <w:cantSplit/>
+        </w:trPr>
+        <w:tc>
+          <w:tcPr>
+            <w:tcW w:type="dxa" w:w="765"/>
+            <w:vAlign w:val="center"/>
+            <w:tcMar>
+              <w:top w:w="75" w:type="dxa"/>
+              <w:bottom w:w="75" w:type="dxa"/>
+              <w:left w:w="75" w:type="dxa"/>
+              <w:right w:w="75" w:type="dxa"/>
+            </w:tcMar>
+            <w:tcBorders>
+              <w:top w:val="single" w:sz="4" w:color="D9D9D9"/>
+              <w:left w:val="single" w:sz="4" w:color="D9D9D9"/>
+              <w:bottom w:val="single" w:sz="4" w:color="D9D9D9"/>
+              <w:right w:val="single" w:sz="4" w:color="D9D9D9"/>
+            </w:tcBorders>
+          </w:tcPr>
+          <w:p>
+            <w:pPr>
+              <w:spacing w:after="0" w:before="0" w:line="264" w:lineRule="auto"/>
+              <w:ind w:firstLine="0"/>
+              <w:jc w:val="center"/>
+            </w:pPr>
+            <w:r>
+              <w:rPr>
+                <w:rFonts w:ascii="Times New Roman" w:hAnsi="Times New Roman" w:eastAsia="Songti SC"/>
+                <w:b w:val="0"/>
+                <w:color w:val="000000"/>
+                <w:sz w:val="19"/>
+              </w:rPr>
+              <w:t>256</w:t>
+            </w:r>
+          </w:p>
+        </w:tc>
+        <w:tc>
+          <w:tcPr>
+            <w:tcW w:type="dxa" w:w="1956"/>
+            <w:vAlign w:val="center"/>
+            <w:tcMar>
+              <w:top w:w="75" w:type="dxa"/>
+              <w:bottom w:w="75" w:type="dxa"/>
+              <w:left w:w="75" w:type="dxa"/>
+              <w:right w:w="75" w:type="dxa"/>
+            </w:tcMar>
+            <w:tcBorders>
+              <w:top w:val="single" w:sz="4" w:color="D9D9D9"/>
+              <w:left w:val="single" w:sz="4" w:color="D9D9D9"/>
+              <w:bottom w:val="single" w:sz="4" w:color="D9D9D9"/>
+              <w:right w:val="single" w:sz="4" w:color="D9D9D9"/>
+            </w:tcBorders>
+          </w:tcPr>
+          <w:p>
+            <w:pPr>
+              <w:spacing w:after="0" w:before="0" w:line="264" w:lineRule="auto"/>
+              <w:ind w:firstLine="0"/>
+              <w:jc w:val="left"/>
+            </w:pPr>
+            <w:r>
+              <w:rPr>
+                <w:rFonts w:ascii="Times New Roman" w:hAnsi="Times New Roman" w:eastAsia="Songti SC"/>
+                <w:b w:val="0"/>
+                <w:color w:val="000000"/>
+                <w:sz w:val="19"/>
+              </w:rPr>
+              <w:t>1,800</w:t>
+            </w:r>
+          </w:p>
+        </w:tc>
+        <w:tc>
+          <w:tcPr>
+            <w:tcW w:type="dxa" w:w="1644"/>
+            <w:vAlign w:val="center"/>
+            <w:tcMar>
+              <w:top w:w="75" w:type="dxa"/>
+              <w:bottom w:w="75" w:type="dxa"/>
+              <w:left w:w="75" w:type="dxa"/>
+              <w:right w:w="75" w:type="dxa"/>
+            </w:tcMar>
+            <w:tcBorders>
+              <w:top w:val="single" w:sz="4" w:color="D9D9D9"/>
+              <w:left w:val="single" w:sz="4" w:color="D9D9D9"/>
+              <w:bottom w:val="single" w:sz="4" w:color="D9D9D9"/>
+              <w:right w:val="single" w:sz="4" w:color="D9D9D9"/>
+            </w:tcBorders>
+          </w:tcPr>
+          <w:p>
+            <w:pPr>
+              <w:spacing w:after="0" w:before="0" w:line="264" w:lineRule="auto"/>
+              <w:ind w:firstLine="0"/>
+              <w:jc w:val="center"/>
+            </w:pPr>
+            <w:r>
+              <w:rPr>
+                <w:rFonts w:ascii="Times New Roman" w:hAnsi="Times New Roman" w:eastAsia="Songti SC"/>
+                <w:b w:val="0"/>
+                <w:color w:val="000000"/>
+                <w:sz w:val="19"/>
+              </w:rPr>
+              <w:t>6/10</w:t>
+            </w:r>
+          </w:p>
+        </w:tc>
+        <w:tc>
+          <w:tcPr>
+            <w:tcW w:type="dxa" w:w="1644"/>
+            <w:vAlign w:val="center"/>
+            <w:tcMar>
+              <w:top w:w="75" w:type="dxa"/>
+              <w:bottom w:w="75" w:type="dxa"/>
+              <w:left w:w="75" w:type="dxa"/>
+              <w:right w:w="75" w:type="dxa"/>
+            </w:tcMar>
+            <w:tcBorders>
+              <w:top w:val="single" w:sz="4" w:color="D9D9D9"/>
+              <w:left w:val="single" w:sz="4" w:color="D9D9D9"/>
+              <w:bottom w:val="single" w:sz="4" w:color="D9D9D9"/>
+              <w:right w:val="single" w:sz="4" w:color="D9D9D9"/>
+            </w:tcBorders>
+          </w:tcPr>
+          <w:p>
+            <w:pPr>
+              <w:spacing w:after="0" w:before="0" w:line="264" w:lineRule="auto"/>
+              <w:ind w:firstLine="0"/>
+              <w:jc w:val="center"/>
+            </w:pPr>
+            <w:r>
+              <w:rPr>
+                <w:rFonts w:ascii="Times New Roman" w:hAnsi="Times New Roman" w:eastAsia="Songti SC"/>
+                <w:b w:val="0"/>
+                <w:color w:val="000000"/>
+                <w:sz w:val="19"/>
+              </w:rPr>
+              <w:t>7/10</w:t>
+            </w:r>
+          </w:p>
+        </w:tc>
+        <w:tc>
+          <w:tcPr>
+            <w:tcW w:type="dxa" w:w="1757"/>
+            <w:vAlign w:val="center"/>
+            <w:tcMar>
+              <w:top w:w="75" w:type="dxa"/>
+              <w:bottom w:w="75" w:type="dxa"/>
+              <w:left w:w="75" w:type="dxa"/>
+              <w:right w:w="75" w:type="dxa"/>
+            </w:tcMar>
+            <w:tcBorders>
+              <w:top w:val="single" w:sz="4" w:color="D9D9D9"/>
+              <w:left w:val="single" w:sz="4" w:color="D9D9D9"/>
+              <w:bottom w:val="single" w:sz="4" w:color="D9D9D9"/>
+              <w:right w:val="single" w:sz="4" w:color="D9D9D9"/>
+            </w:tcBorders>
+          </w:tcPr>
+          <w:p>
+            <w:pPr>
+              <w:spacing w:after="0" w:before="0" w:line="264" w:lineRule="auto"/>
+              <w:ind w:firstLine="0"/>
+              <w:jc w:val="center"/>
+            </w:pPr>
+            <w:r>
+              <w:rPr>
+                <w:rFonts w:ascii="Times New Roman" w:hAnsi="Times New Roman" w:eastAsia="Songti SC"/>
+                <w:b w:val="0"/>
+                <w:color w:val="000000"/>
+                <w:sz w:val="19"/>
+              </w:rPr>
+              <w:t>3/3</w:t>
+            </w:r>
+          </w:p>
+        </w:tc>
+        <w:tc>
+          <w:tcPr>
+            <w:tcW w:type="dxa" w:w="1979"/>
+            <w:vAlign w:val="center"/>
+            <w:tcMar>
+              <w:top w:w="75" w:type="dxa"/>
+              <w:bottom w:w="75" w:type="dxa"/>
+              <w:left w:w="75" w:type="dxa"/>
+              <w:right w:w="75" w:type="dxa"/>
+            </w:tcMar>
+            <w:tcBorders>
+              <w:top w:val="single" w:sz="4" w:color="D9D9D9"/>
+              <w:left w:val="single" w:sz="4" w:color="D9D9D9"/>
+              <w:bottom w:val="single" w:sz="4" w:color="D9D9D9"/>
+              <w:right w:val="single" w:sz="4" w:color="D9D9D9"/>
+            </w:tcBorders>
+          </w:tcPr>
+          <w:p>
+            <w:pPr>
+              <w:spacing w:after="0" w:before="0" w:line="264" w:lineRule="auto"/>
+              <w:ind w:firstLine="0"/>
+              <w:jc w:val="center"/>
+            </w:pPr>
+            <w:r>
+              <w:rPr>
+                <w:rFonts w:ascii="Times New Roman" w:hAnsi="Times New Roman" w:eastAsia="Songti SC"/>
+                <w:b w:val="0"/>
+                <w:color w:val="000000"/>
+                <w:sz w:val="19"/>
+              </w:rPr>
+              <w:t>3/3</w:t>
+            </w:r>
+          </w:p>
+        </w:tc>
+      </w:tr>
+      <w:tr>
+        <w:trPr>
+          <w:cantSplit/>
+        </w:trPr>
+        <w:tc>
+          <w:tcPr>
+            <w:tcW w:type="dxa" w:w="765"/>
+            <w:vAlign w:val="center"/>
+            <w:tcMar>
+              <w:top w:w="75" w:type="dxa"/>
+              <w:bottom w:w="75" w:type="dxa"/>
+              <w:left w:w="75" w:type="dxa"/>
+              <w:right w:w="75" w:type="dxa"/>
+            </w:tcMar>
+            <w:tcBorders>
+              <w:top w:val="single" w:sz="4" w:color="D9D9D9"/>
+              <w:left w:val="single" w:sz="4" w:color="D9D9D9"/>
+              <w:bottom w:val="single" w:sz="4" w:color="D9D9D9"/>
+              <w:right w:val="single" w:sz="4" w:color="D9D9D9"/>
+            </w:tcBorders>
+          </w:tcPr>
+          <w:p>
+            <w:pPr>
+              <w:spacing w:after="0" w:before="0" w:line="264" w:lineRule="auto"/>
+              <w:ind w:firstLine="0"/>
+              <w:jc w:val="center"/>
+            </w:pPr>
+            <w:r>
+              <w:rPr>
+                <w:rFonts w:ascii="Times New Roman" w:hAnsi="Times New Roman" w:eastAsia="Songti SC"/>
+                <w:b w:val="0"/>
+                <w:color w:val="000000"/>
+                <w:sz w:val="19"/>
+              </w:rPr>
+              <w:t>256</w:t>
+            </w:r>
+          </w:p>
+        </w:tc>
+        <w:tc>
+          <w:tcPr>
+            <w:tcW w:type="dxa" w:w="1956"/>
+            <w:vAlign w:val="center"/>
+            <w:tcMar>
+              <w:top w:w="75" w:type="dxa"/>
+              <w:bottom w:w="75" w:type="dxa"/>
+              <w:left w:w="75" w:type="dxa"/>
+              <w:right w:w="75" w:type="dxa"/>
+            </w:tcMar>
+            <w:tcBorders>
+              <w:top w:val="single" w:sz="4" w:color="D9D9D9"/>
+              <w:left w:val="single" w:sz="4" w:color="D9D9D9"/>
+              <w:bottom w:val="single" w:sz="4" w:color="D9D9D9"/>
+              <w:right w:val="single" w:sz="4" w:color="D9D9D9"/>
+            </w:tcBorders>
+          </w:tcPr>
+          <w:p>
+            <w:pPr>
+              <w:spacing w:after="0" w:before="0" w:line="264" w:lineRule="auto"/>
+              <w:ind w:firstLine="0"/>
+              <w:jc w:val="left"/>
+            </w:pPr>
+            <w:r>
+              <w:rPr>
+                <w:rFonts w:ascii="Times New Roman" w:hAnsi="Times New Roman" w:eastAsia="Songti SC"/>
+                <w:b w:val="0"/>
+                <w:color w:val="000000"/>
+                <w:sz w:val="19"/>
+              </w:rPr>
+              <w:t>3,200</w:t>
+            </w:r>
+          </w:p>
+        </w:tc>
+        <w:tc>
+          <w:tcPr>
+            <w:tcW w:type="dxa" w:w="1644"/>
+            <w:vAlign w:val="center"/>
+            <w:tcMar>
+              <w:top w:w="75" w:type="dxa"/>
+              <w:bottom w:w="75" w:type="dxa"/>
+              <w:left w:w="75" w:type="dxa"/>
+              <w:right w:w="75" w:type="dxa"/>
+            </w:tcMar>
+            <w:tcBorders>
+              <w:top w:val="single" w:sz="4" w:color="D9D9D9"/>
+              <w:left w:val="single" w:sz="4" w:color="D9D9D9"/>
+              <w:bottom w:val="single" w:sz="4" w:color="D9D9D9"/>
+              <w:right w:val="single" w:sz="4" w:color="D9D9D9"/>
+            </w:tcBorders>
+          </w:tcPr>
+          <w:p>
+            <w:pPr>
+              <w:spacing w:after="0" w:before="0" w:line="264" w:lineRule="auto"/>
+              <w:ind w:firstLine="0"/>
+              <w:jc w:val="center"/>
+            </w:pPr>
+            <w:r>
+              <w:rPr>
+                <w:rFonts w:ascii="Times New Roman" w:hAnsi="Times New Roman" w:eastAsia="Songti SC"/>
+                <w:b w:val="0"/>
+                <w:color w:val="000000"/>
+                <w:sz w:val="19"/>
+              </w:rPr>
+              <w:t>6/10</w:t>
+            </w:r>
+          </w:p>
+        </w:tc>
+        <w:tc>
+          <w:tcPr>
+            <w:tcW w:type="dxa" w:w="1644"/>
+            <w:vAlign w:val="center"/>
+            <w:tcMar>
+              <w:top w:w="75" w:type="dxa"/>
+              <w:bottom w:w="75" w:type="dxa"/>
+              <w:left w:w="75" w:type="dxa"/>
+              <w:right w:w="75" w:type="dxa"/>
+            </w:tcMar>
+            <w:tcBorders>
+              <w:top w:val="single" w:sz="4" w:color="D9D9D9"/>
+              <w:left w:val="single" w:sz="4" w:color="D9D9D9"/>
+              <w:bottom w:val="single" w:sz="4" w:color="D9D9D9"/>
+              <w:right w:val="single" w:sz="4" w:color="D9D9D9"/>
+            </w:tcBorders>
+          </w:tcPr>
+          <w:p>
+            <w:pPr>
+              <w:spacing w:after="0" w:before="0" w:line="264" w:lineRule="auto"/>
+              <w:ind w:firstLine="0"/>
+              <w:jc w:val="center"/>
+            </w:pPr>
+            <w:r>
+              <w:rPr>
+                <w:rFonts w:ascii="Times New Roman" w:hAnsi="Times New Roman" w:eastAsia="Songti SC"/>
+                <w:b w:val="0"/>
+                <w:color w:val="000000"/>
+                <w:sz w:val="19"/>
+              </w:rPr>
+              <w:t>7/10</w:t>
+            </w:r>
+          </w:p>
+        </w:tc>
+        <w:tc>
+          <w:tcPr>
+            <w:tcW w:type="dxa" w:w="1757"/>
+            <w:vAlign w:val="center"/>
+            <w:tcMar>
+              <w:top w:w="75" w:type="dxa"/>
+              <w:bottom w:w="75" w:type="dxa"/>
+              <w:left w:w="75" w:type="dxa"/>
+              <w:right w:w="75" w:type="dxa"/>
+            </w:tcMar>
+            <w:tcBorders>
+              <w:top w:val="single" w:sz="4" w:color="D9D9D9"/>
+              <w:left w:val="single" w:sz="4" w:color="D9D9D9"/>
+              <w:bottom w:val="single" w:sz="4" w:color="D9D9D9"/>
+              <w:right w:val="single" w:sz="4" w:color="D9D9D9"/>
+            </w:tcBorders>
+          </w:tcPr>
+          <w:p>
+            <w:pPr>
+              <w:spacing w:after="0" w:before="0" w:line="264" w:lineRule="auto"/>
+              <w:ind w:firstLine="0"/>
+              <w:jc w:val="center"/>
+            </w:pPr>
+            <w:r>
+              <w:rPr>
+                <w:rFonts w:ascii="Times New Roman" w:hAnsi="Times New Roman" w:eastAsia="Songti SC"/>
+                <w:b w:val="0"/>
+                <w:color w:val="000000"/>
+                <w:sz w:val="19"/>
+              </w:rPr>
+              <w:t>3/3</w:t>
+            </w:r>
+          </w:p>
+        </w:tc>
+        <w:tc>
+          <w:tcPr>
+            <w:tcW w:type="dxa" w:w="1979"/>
+            <w:vAlign w:val="center"/>
+            <w:tcMar>
+              <w:top w:w="75" w:type="dxa"/>
+              <w:bottom w:w="75" w:type="dxa"/>
+              <w:left w:w="75" w:type="dxa"/>
+              <w:right w:w="75" w:type="dxa"/>
+            </w:tcMar>
+            <w:tcBorders>
+              <w:top w:val="single" w:sz="4" w:color="D9D9D9"/>
+              <w:left w:val="single" w:sz="4" w:color="D9D9D9"/>
+              <w:bottom w:val="single" w:sz="4" w:color="D9D9D9"/>
+              <w:right w:val="single" w:sz="4" w:color="D9D9D9"/>
+            </w:tcBorders>
+          </w:tcPr>
+          <w:p>
+            <w:pPr>
+              <w:spacing w:after="0" w:before="0" w:line="264" w:lineRule="auto"/>
+              <w:ind w:firstLine="0"/>
+              <w:jc w:val="center"/>
+            </w:pPr>
+            <w:r>
+              <w:rPr>
+                <w:rFonts w:ascii="Times New Roman" w:hAnsi="Times New Roman" w:eastAsia="Songti SC"/>
+                <w:b w:val="0"/>
+                <w:color w:val="000000"/>
+                <w:sz w:val="19"/>
+              </w:rPr>
+              <w:t>3/3</w:t>
+            </w:r>
+          </w:p>
+        </w:tc>
+      </w:tr>
+    </w:tbl>
+    <w:p>
+      <w:pPr>
+        <w:spacing w:after="40" w:before="0" w:line="240" w:lineRule="auto"/>
+      </w:pPr>
+      <w:r>
+        <w:rPr>
+          <w:sz w:val="4"/>
+        </w:rPr>
+      </w:r>
+    </w:p>
+    <w:p>
+      <w:pPr>
+        <w:ind w:firstLine="440"/>
+      </w:pPr>
+      <w:r>
+        <w:rPr>
+          <w:rFonts w:ascii="Times New Roman" w:hAnsi="Times New Roman" w:eastAsia="Songti SC"/>
+          <w:color w:val="000000"/>
+        </w:rPr>
+        <w:t>主终点要求目标观察与限定位于同一个、可由原始来源逐字重建的Fact item中；目标仅出现在关系路径或head引用不计入该分子，另保留诊断，不能据item缺失断言整包完全没有目标。两种预算在这些主终点上相同，未观察到提高预算的独立改善。每个共同配置的两个时间问题均为首条item正确，但这仅验证预声明输入下的排序，不能推广为任意时间推理。负向严格空覆盖歧义错拼与两种无证据查询，不是模型拒答或广泛安全评测。</w:t>
+      </w:r>
+    </w:p>
+    <w:p>
+      <w:pPr>
+        <w:keepNext/>
+        <w:jc w:val="center"/>
+      </w:pPr>
+      <w:r>
+        <w:drawing>
+          <wp:inline xmlns:a="http://schemas.openxmlformats.org/drawingml/2006/main" xmlns:pic="http://schemas.openxmlformats.org/drawingml/2006/picture">
+            <wp:extent cx="6156000" cy="4104000"/>
+            <wp:docPr id="5" name="Picture 5"/>
+            <wp:cNvGraphicFramePr>
+              <a:graphicFrameLocks noChangeAspect="1"/>
+            </wp:cNvGraphicFramePr>
+            <a:graphic>
+              <a:graphicData uri="http://schemas.openxmlformats.org/drawingml/2006/picture">
+                <pic:pic>
+                  <pic:nvPicPr>
+                    <pic:cNvPr id="0" name="longtail.png"/>
+                    <pic:cNvPicPr/>
+                  </pic:nvPicPr>
+                  <pic:blipFill>
+                    <a:blip r:embed="rId15"/>
+                    <a:stretch>
+                      <a:fillRect/>
+                    </a:stretch>
+                  </pic:blipFill>
+                  <pic:spPr>
+                    <a:xfrm>
+                      <a:off x="0" y="0"/>
+                      <a:ext cx="6156000" cy="4104000"/>
+                    </a:xfrm>
+                    <a:prstGeom prst="rect"/>
+                  </pic:spPr>
+                </pic:pic>
+              </a:graphicData>
+            </a:graphic>
+          </wp:inline>
+        </w:drawing>
+      </w:r>
+    </w:p>
+    <w:p>
+      <w:pPr>
+        <w:pStyle w:val="Caption"/>
+        <w:keepNext w:val="0"/>
+      </w:pPr>
+      <w:r>
+        <w:rPr>
+          <w:rFonts w:ascii="Times New Roman" w:hAnsi="Times New Roman" w:eastAsia="Songti SC"/>
+          <w:color w:val="000000"/>
+        </w:rPr>
+        <w:t>图5 默认与来源正文配置的分类型结果。A为同条Fact中的目标观察与限定共同交付；B为负向查询未携带有效背景正文。每个单情境含三档历史长度与两档预算，共6个相关条件；别名合并两个情境为12个条件。右侧明确给出默认/原文配置分子分母，未构造独立重复或总体置信区间。局部开关消融结果另列补充材料，不混入共同配置分母。</w:t>
+      </w:r>
+    </w:p>
+    <w:p>
+      <w:pPr>
+        <w:ind w:firstLine="440"/>
+      </w:pPr>
+      <w:r>
+        <w:rPr>
+          <w:rFonts w:ascii="Times New Roman" w:hAnsi="Times New Roman" w:eastAsia="Songti SC"/>
+          <w:color w:val="000000"/>
+        </w:rPr>
+        <w:t>干扰达到256条时，默认配置只有8/10个目标进入候选，启用来源正文后为10/10；但最终共同交付仅由6/10改善为7/10。词表外的time to live未能访问仅以“存活时间”表述的目标，两种配置均为0/6。广度优先搜索别名在64与256条干扰下虽已取得目标候选，仍受到带“搜索树”“优先级”等词的背景排挤。来源可追溯不等于来源能被正确检索，目标进入候选也不等于进入最终包。</w:t>
+      </w:r>
+    </w:p>
+    <w:p>
+      <w:pPr>
+        <w:ind w:firstLine="440"/>
+      </w:pPr>
+      <w:r>
+        <w:rPr>
+          <w:rFonts w:ascii="Times New Roman" w:hAnsi="Times New Roman" w:eastAsia="Songti SC"/>
+          <w:color w:val="000000"/>
+        </w:rPr>
+        <w:t>一个反向案例说明增大候选池的局部代价。在256条干扰下，来源正文配置形成514份候选文档，超过错拼处理的512份扫描上限，schedulr未获得有效纠正；默认配置在该情境反而成功。该边界不能靠“完整系统始终优于精简配置”解释。原文读取对正文尾部与分离限定有作用，但词表、候选、纠错和预算必须共同评价；这些是读取组件的效果，不是五个核各自的因果收益。</w:t>
+      </w:r>
+    </w:p>
+    <w:p>
+      <w:pPr>
+        <w:ind w:firstLine="440"/>
+      </w:pPr>
+      <w:r>
+        <w:rPr>
+          <w:rFonts w:ascii="Times New Roman" w:hAnsi="Times New Roman" w:eastAsia="Songti SC"/>
+          <w:color w:val="000000"/>
+        </w:rPr>
+        <w:t>局部开关对照进一步定位组件作用。在全部适用历史与预算条件中，关闭别名后，两种共同配置的别名目标与限定交付均从8/12降至0/12；关闭错拼后，唯一错拼情境的默认配置从6/6降至0/6，来源正文配置从4/6降至0/6；关闭时间组件后，两种配置的最初/当前目标交付与首项正确均从12/12降至6/12，损失均发生于最初问题。歧义错拼负控在开关条件下仍保持严格空。这些分母是相关条件数，因果解释限于同一固定产品和输入下关闭该组件的总体作用，不是跨模型或真实人群效应。次要诊断显示，180个有目标读取条件中没有仅靠关系路径补齐主指标的情况；非Human head没有证据正文，引用不能补算正文交付。</w:t>
+      </w:r>
+    </w:p>
+    <w:p>
+      <w:pPr>
+        <w:ind w:firstLine="440"/>
+      </w:pPr>
+      <w:r>
+        <w:rPr>
+          <w:rFonts w:ascii="Times New Roman" w:hAnsi="Times New Roman" w:eastAsia="Songti SC"/>
+          <w:color w:val="000000"/>
+        </w:rPr>
+        <w:t>两次先前运行及冻结源码完整保留。第一轮在建库阶段错误创建重复Roadmap，228个条件均未进入检索；同时在尚无检索成绩时纠正了将合法跨会话持久Fact视为污染的错误假设。第二轮完成228次读取，但验证器误拒合法SAME_SUBJECT关系，并在部分条件中混淆数量相同的head与候选元数据调用。后继只修正原生边与端点闭包核验和调用点追踪，未改变情境、查询、目标文字、预算或读取策略，重新冻结后全量执行。前两轮不进入正式性能分母，修订前结果不能被描述为系统检索失败。</w:t>
+      </w:r>
+    </w:p>
+    <w:p>
+      <w:pPr>
         <w:pStyle w:val="Heading1"/>
       </w:pPr>
       <w:r>
@@ -6975,6 +9862,18 @@
           <w:rFonts w:ascii="Times New Roman" w:hAnsi="Times New Roman" w:eastAsia="Songti SC"/>
           <w:color w:val="000000"/>
         </w:rPr>
+        <w:t>对象交互挑战要求将“曾经达到稳定门”与“当前仍满足稳定资格”显式分开。后续修正应保留旧成功Event和Fact作为历史，同时由新的失败证据使当前稳定资格失效，记录原因及来源；工作台、长期状态和模型上下文应消费同一资格结果。直接删除旧成功证据会破坏学习历史，继续让未限定的stable字段供不同消费者各自解释也不足以解决一致性问题。这一升级需要新的状态转换回归和兼容性说明，不能由论文措辞代替实现。</w:t>
+      </w:r>
+    </w:p>
+    <w:p>
+      <w:pPr>
+        <w:ind w:firstLine="440"/>
+      </w:pPr>
+      <w:r>
+        <w:rPr>
+          <w:rFonts w:ascii="Times New Roman" w:hAnsi="Times New Roman" w:eastAsia="Songti SC"/>
+          <w:color w:val="000000"/>
+        </w:rPr>
         <w:t>本轮模型读取失败集中在过期控制和条件组合。优先升级方向是将有效期、辅助等级和来源资格形成统一、版本化的读取契约，并将已有规划约束接入尚未统一的消费者和研究读取器，单独验证最终动作。Tutor、规划、讲义与 Practice 应保留一致解释，确定性约束器检查明确的时间和证据上限，不应以生成模型的解释替代评分或直接写状态。已有约束存在与全部消费路径已接入，是两个不同验收命题。</w:t>
       </w:r>
     </w:p>
@@ -7023,7 +9922,7 @@
           <w:rFonts w:ascii="Times New Roman" w:hAnsi="Times New Roman" w:eastAsia="Songti SC"/>
           <w:color w:val="000000"/>
         </w:rPr>
-        <w:t>但自动验证器只能验证其定义的操作规则。它不能证明所选下一步最有教学价值，不能替代教师对讲解质量的判断，也不能证明学习者更愿意持续学习。本文因此将“教学操作一致性”与“教育效果”严格区分。无需人工的新研究可以扩大预先冻结的长尾组合、跨课程冲突、取消与多周演化，并在多个模型和提示条件下复现；真实学习增益最终仍需要独立的课堂或用户研究。</w:t>
+        <w:t>但自动验证器只能验证其定义的操作规则。它不能证明所选下一步最有教学价值，不能替代教师对讲解质量的判断，也不能证明学习者更愿意持续学习。本文因此将“教学操作一致性”与“教育效果”严格区分。本次已经补充定向长尾来源读取与部分跨周组合，但它们还不是同一真实学生任务中的完整检索、规划与学习闭环。下一步应冻结新的组合任务，把稀有证据的实际召回与最终业务动作连接，在多个模型和提示条件下复现；真实学习增益仍需要独立的课堂或用户研究。</w:t>
       </w:r>
     </w:p>
     <w:p>
@@ -7083,7 +9982,7 @@
           <w:rFonts w:ascii="Times New Roman" w:hAnsi="Times New Roman" w:eastAsia="Songti SC"/>
           <w:color w:val="000000"/>
         </w:rPr>
-        <w:t>第四，完整操作一致性较严格，而动作指标有天花板；稳定掌握是固定否定控制。两档输入均保留必需证据，因此未测试缺失关键来源时的合理未覆盖处理。来源核验和程序答案减少部分主观性，但不能建立最优教学策略的外部效度。</w:t>
+        <w:t>第四，既有模型实验的完整操作一致性较严格，而动作指标有天花板；稳定掌握是固定否定控制，两档输入均保留必需证据。新增原生交互虽检查了规则稳定正例与后继失败，仍使用固定小题及注入时钟；新增无证据读取检查的是空包行为，没有测量模型拒答。来源核验和程序答案减少部分主观性，但不能建立最优教学策略的外部效度。</w:t>
       </w:r>
     </w:p>
     <w:p>
@@ -7096,6 +9995,18 @@
           <w:color w:val="000000"/>
         </w:rPr>
         <w:t>第五，本文没有在相同数据、模型、预算和调参条件下运行外部记忆算法官方实现，也没有对知识追踪进行预测比较。相关工作表只能支撑机制定位。五核数量与划分的最优性尚未验证，跨宿主消费者也未全部使用同一研究接口。</w:t>
+      </w:r>
+    </w:p>
+    <w:p>
+      <w:pPr>
+        <w:ind w:firstLine="440"/>
+      </w:pPr>
+      <w:r>
+        <w:rPr>
+          <w:rFonts w:ascii="Times New Roman" w:hAnsi="Times New Roman" w:eastAsia="Songti SC"/>
+          <w:color w:val="000000"/>
+        </w:rPr>
+        <w:t>第六，十二个长尾情境由作者定向编写，干扰语料循环重复，只有有限的历史与词表压力；原生user_message正文还受500字符上限约束。该组实际激活的是Knowledge自述文本，不能作为五个核的均衡长尾评价；图中的原生SAME_SUBJECT关系也不等于深层先修依赖推理。十四个交互情境调用服务/API函数，没有覆盖HTTP中间件、浏览器交互或两个宿主的完整路径。验证器修订与全部失败运行公开，但尚未获得独立团队复现。</w:t>
       </w:r>
     </w:p>
     <w:p>
@@ -7119,7 +10030,7 @@
           <w:rFonts w:ascii="Times New Roman" w:hAnsi="Times New Roman" w:eastAsia="Songti SC"/>
           <w:color w:val="000000"/>
         </w:rPr>
-        <w:t>本文研究学习证据的条件化使用，给出五核学习者状态的具体分工、统一权威写入链和真实消费者边界。五核分别提供学习位置、概念证据、支持条件、目标优先级及实践条件，使本系统以显式规则表达教学语义。它们与检索、分层记忆、知识追踪及开放学习者模型互补，并不自动替代这些方法。</w:t>
+        <w:t>本文研究学习证据的条件化使用，给出五核学习者状态的具体分工、统一权威写入链和真实消费者边界。五核分别提供学习位置、概念证据、支持条件、目标优先级及实践条件；学习路径、LearningTask和ReviewSchedule承载相应教学安排与操作状态，工作台组织执行。确认路线、完成任务、复习到期与实际掌握具有不同语义，系统通过零核目标操作与正式证据事件区分它们。</w:t>
       </w:r>
     </w:p>
     <w:p>
@@ -7131,7 +10042,7 @@
           <w:rFonts w:ascii="Times New Roman" w:hAnsi="Times New Roman" w:eastAsia="Songti SC"/>
           <w:color w:val="000000"/>
         </w:rPr>
-        <w:t>等信息实验显示，显式资格注释有较稳定的改善作用，而五核分组的独立增量对信息条件及输出契约敏感。当前可以成立的结论是：该系统提供了可追溯、可区分证据等级的教育记忆基础，并能通过自动化实验定位过期画像与约束组合失败；尚不能宣称其全面优于现有记忆方法或已经提升真实学习效果。面向后续研究，统一最终消费契约、构造更有区分度的教学操作任务以及独立复现，比继续增加记忆层次更有证据依据。</w:t>
+        <w:t>补充验证证明了所列对象交互和部分跨周控制规则，同时暴露再次失败后长期stable标记仍保留的问题。长尾读取中，来源正文配置改善了目标与限定交付，但候选窗口、别名排序和错拼扫描仍造成失败，扩大候选池也可能退化。因此，五核在长尾任务中的价值是为历史证据提供教育语义和约束接口，实际任务能力仍取决于召回、状态失效与最终消费共同成立。结合等信息模型实验，当前证据支持可追溯教育记忆基础与可反驳的工程验证方法，尚不支持五核全面优于已有记忆或改善真实学习效果的主张。</w:t>
       </w:r>
     </w:p>
     <w:p>
@@ -7155,7 +10066,7 @@
           <w:rFonts w:ascii="Times New Roman" w:hAnsi="Times New Roman" w:eastAsia="Songti SC"/>
           <w:color w:val="000000"/>
         </w:rPr>
-        <w:t>本论文随仓库提供 Markdown、可编辑 Word、PDF、图形生成脚本及矢量图。既有反事实实验保存冻结源码、输入、原始响应、独立审计和聚合结果；本轮原生能力核验提供协议、案例、真实中间产物与复现方式。补充材料S1给出每项主张与代码、案例及结果文件的对应关系。正式产物 hash用于检测变化，不代表已完成第三方复现。外部基准遵循原始来源的使用条件，本文不额外发布其完整对话正文。</w:t>
+        <w:t>本论文随仓库提供 Markdown、可编辑 Word、PDF、图形生成脚本及矢量图。既有反事实实验保存冻结源码、输入、原始响应、独立审计和聚合结果；原生能力、教学对象交互与长尾读取核验均提供协议、案例、真实中间产物、失败轮次与复现方式。补充材料S1–S3给出各项主张与代码、案例及结果文件的对应关系。正式产物 hash用于检测变化，不代表已完成第三方复现。外部基准遵循原始来源的使用条件，本文不额外发布其完整对话正文。</w:t>
       </w:r>
     </w:p>
     <w:p>
@@ -7207,7 +10118,7 @@
         </w:rPr>
         <w:t xml:space="preserve">[1] Patrick Lewis; Ethan Perez; Aleksandra Piktus; et al. </w:t>
       </w:r>
-      <w:hyperlink r:id="rId14">
+      <w:hyperlink r:id="rId16">
         <w:r>
           <w:rPr>
             <w:rFonts w:ascii="Times New Roman" w:eastAsia="Songti SC"/>
@@ -7239,7 +10150,7 @@
         </w:rPr>
         <w:t xml:space="preserve">[2] Joon Sung Park; Joseph C. O'Brien; Carrie J. Cai; et al. </w:t>
       </w:r>
-      <w:hyperlink r:id="rId15">
+      <w:hyperlink r:id="rId17">
         <w:r>
           <w:rPr>
             <w:rFonts w:ascii="Times New Roman" w:eastAsia="Songti SC"/>
@@ -7271,7 +10182,7 @@
         </w:rPr>
         <w:t xml:space="preserve">[3] Charles Packer; Sarah Wooders; Kevin Lin; et al. </w:t>
       </w:r>
-      <w:hyperlink r:id="rId16">
+      <w:hyperlink r:id="rId18">
         <w:r>
           <w:rPr>
             <w:rFonts w:ascii="Times New Roman" w:eastAsia="Songti SC"/>
@@ -7303,7 +10214,7 @@
         </w:rPr>
         <w:t xml:space="preserve">[4] Wanjun Zhong; Lianghong Guo; Qiqi Gao; et al. </w:t>
       </w:r>
-      <w:hyperlink r:id="rId17">
+      <w:hyperlink r:id="rId19">
         <w:r>
           <w:rPr>
             <w:rFonts w:ascii="Times New Roman" w:eastAsia="Songti SC"/>
@@ -7335,7 +10246,7 @@
         </w:rPr>
         <w:t xml:space="preserve">[5] Prateek Chhikara; Dev Khant; Saket Aryan; et al. </w:t>
       </w:r>
-      <w:hyperlink r:id="rId18">
+      <w:hyperlink r:id="rId20">
         <w:r>
           <w:rPr>
             <w:rFonts w:ascii="Times New Roman" w:eastAsia="Songti SC"/>
@@ -7367,7 +10278,7 @@
         </w:rPr>
         <w:t xml:space="preserve">[6] Wujiang Xu; Zujie Liang; Kai Mei; et al. </w:t>
       </w:r>
-      <w:hyperlink r:id="rId19">
+      <w:hyperlink r:id="rId21">
         <w:r>
           <w:rPr>
             <w:rFonts w:ascii="Times New Roman" w:eastAsia="Songti SC"/>
@@ -7399,7 +10310,7 @@
         </w:rPr>
         <w:t xml:space="preserve">[7] Albert T. Corbett; John R. Anderson. </w:t>
       </w:r>
-      <w:hyperlink r:id="rId20">
+      <w:hyperlink r:id="rId22">
         <w:r>
           <w:rPr>
             <w:rFonts w:ascii="Times New Roman" w:eastAsia="Songti SC"/>
@@ -7431,7 +10342,7 @@
         </w:rPr>
         <w:t xml:space="preserve">[8] Chris Piech; Jonathan Bassen; Jonathan Huang; et al. </w:t>
       </w:r>
-      <w:hyperlink r:id="rId21">
+      <w:hyperlink r:id="rId23">
         <w:r>
           <w:rPr>
             <w:rFonts w:ascii="Times New Roman" w:eastAsia="Songti SC"/>
@@ -7463,7 +10374,7 @@
         </w:rPr>
         <w:t xml:space="preserve">[9] Aritra Ghosh; Neil Heffernan; Andrew S. Lan. </w:t>
       </w:r>
-      <w:hyperlink r:id="rId22">
+      <w:hyperlink r:id="rId24">
         <w:r>
           <w:rPr>
             <w:rFonts w:ascii="Times New Roman" w:eastAsia="Songti SC"/>
@@ -7495,7 +10406,7 @@
         </w:rPr>
         <w:t xml:space="preserve">[10] Susan Bull; Judy Kay. </w:t>
       </w:r>
-      <w:hyperlink r:id="rId23">
+      <w:hyperlink r:id="rId25">
         <w:r>
           <w:rPr>
             <w:rFonts w:ascii="Times New Roman" w:eastAsia="Songti SC"/>
@@ -7527,7 +10438,7 @@
         </w:rPr>
         <w:t xml:space="preserve">[11] Nelson F. Liu; Kevin Lin; John Hewitt; et al. </w:t>
       </w:r>
-      <w:hyperlink r:id="rId24">
+      <w:hyperlink r:id="rId26">
         <w:r>
           <w:rPr>
             <w:rFonts w:ascii="Times New Roman" w:eastAsia="Songti SC"/>
@@ -7559,7 +10470,7 @@
         </w:rPr>
         <w:t xml:space="preserve">[12] Di Wu; Hongwei Wang; Wenhao Yu; et al. </w:t>
       </w:r>
-      <w:hyperlink r:id="rId25">
+      <w:hyperlink r:id="rId27">
         <w:r>
           <w:rPr>
             <w:rFonts w:ascii="Times New Roman" w:eastAsia="Songti SC"/>
@@ -7591,7 +10502,7 @@
         </w:rPr>
         <w:t xml:space="preserve">[13] Adyasha Maharana; Dong-Ho Lee; Sergey Tulyakov; et al. </w:t>
       </w:r>
-      <w:hyperlink r:id="rId26">
+      <w:hyperlink r:id="rId28">
         <w:r>
           <w:rPr>
             <w:rFonts w:ascii="Times New Roman" w:eastAsia="Songti SC"/>
@@ -7623,7 +10534,7 @@
         </w:rPr>
         <w:t xml:space="preserve">[14] Susan Bull; Judy Kay. </w:t>
       </w:r>
-      <w:hyperlink r:id="rId27">
+      <w:hyperlink r:id="rId29">
         <w:r>
           <w:rPr>
             <w:rFonts w:ascii="Times New Roman" w:eastAsia="Songti SC"/>
@@ -7655,7 +10566,7 @@
         </w:rPr>
         <w:t xml:space="preserve">[15] Susan Bull. </w:t>
       </w:r>
-      <w:hyperlink r:id="rId28">
+      <w:hyperlink r:id="rId30">
         <w:r>
           <w:rPr>
             <w:rFonts w:ascii="Times New Roman" w:eastAsia="Songti SC"/>
@@ -7687,7 +10598,7 @@
         </w:rPr>
         <w:t xml:space="preserve">[16] Bingxi Zhao; Jiahao Zhang; Xubin Ren; et al. </w:t>
       </w:r>
-      <w:hyperlink r:id="rId29">
+      <w:hyperlink r:id="rId31">
         <w:r>
           <w:rPr>
             <w:rFonts w:ascii="Times New Roman" w:eastAsia="Songti SC"/>
@@ -7719,7 +10630,7 @@
         </w:rPr>
         <w:t xml:space="preserve">[17] Preston Rasmussen; Pavlo Paliychuk; Travis Beauvais; et al. </w:t>
       </w:r>
-      <w:hyperlink r:id="rId30">
+      <w:hyperlink r:id="rId32">
         <w:r>
           <w:rPr>
             <w:rFonts w:ascii="Times New Roman" w:eastAsia="Songti SC"/>
@@ -7751,7 +10662,7 @@
         </w:rPr>
         <w:t xml:space="preserve">[18] DeepSeek. </w:t>
       </w:r>
-      <w:hyperlink r:id="rId31">
+      <w:hyperlink r:id="rId33">
         <w:r>
           <w:rPr>
             <w:rFonts w:ascii="Times New Roman" w:eastAsia="Songti SC"/>

</xml_diff>